<commit_message>
Record corrected submission package tag target
</commit_message>
<xml_diff>
--- a/docs/deliverables/Evidence_Index.docx
+++ b/docs/deliverables/Evidence_Index.docx
@@ -1099,7 +1099,7 @@
                 <w:rPr>
                   <w:rStyle w:val="VerbatimChar"/>
                 </w:rPr>
-                <w:t xml:space="preserve">ca02d00</w:t>
+                <w:t xml:space="preserve">c226841</w:t>
               </w:r>
             </w:hyperlink>
           </w:p>
@@ -1759,30 +1759,30 @@
                 <w:rPr>
                   <w:rStyle w:val="VerbatimChar"/>
                 </w:rPr>
-                <w:t xml:space="preserve">ca02d00</w:t>
-              </w:r>
-            </w:hyperlink>
-          </w:p>
-        </w:tc>
-        <w:tc>
-          <w:tcPr/>
-          <w:p>
-            <w:pPr>
-              <w:pStyle w:val="Compact"/>
-            </w:pPr>
-            <w:r>
-              <w:t xml:space="preserve">29/08/2026</w:t>
-            </w:r>
-          </w:p>
-        </w:tc>
-        <w:tc>
-          <w:tcPr/>
-          <w:p>
-            <w:pPr>
-              <w:pStyle w:val="Compact"/>
-            </w:pPr>
-            <w:r>
-              <w:t xml:space="preserve">Final report draft, all Word deliverables, the presentation, the tracker, this index, the AI usage log, and the completed validation report included</w:t>
+                <w:t xml:space="preserve">c226841</w:t>
+              </w:r>
+            </w:hyperlink>
+          </w:p>
+        </w:tc>
+        <w:tc>
+          <w:tcPr/>
+          <w:p>
+            <w:pPr>
+              <w:pStyle w:val="Compact"/>
+            </w:pPr>
+            <w:r>
+              <w:t xml:space="preserve">01/09/2026</w:t>
+            </w:r>
+          </w:p>
+        </w:tc>
+        <w:tc>
+          <w:tcPr/>
+          <w:p>
+            <w:pPr>
+              <w:pStyle w:val="Compact"/>
+            </w:pPr>
+            <w:r>
+              <w:t xml:space="preserve">Final report draft, all Word deliverables, the presentation, the tracker, this index, the AI usage log, release metadata, and the completed validation report included</w:t>
             </w:r>
           </w:p>
         </w:tc>
@@ -2599,6 +2599,47 @@
             </w:pPr>
             <w:r>
               <w:t xml:space="preserve">Presentation architecture diagram (latest state)</w:t>
+            </w:r>
+          </w:p>
+        </w:tc>
+      </w:tr>
+      <w:tr>
+        <w:tc>
+          <w:tcPr/>
+          <w:p>
+            <w:pPr>
+              <w:pStyle w:val="Compact"/>
+            </w:pPr>
+            <w:hyperlink r:id="rId45">
+              <w:r>
+                <w:rPr>
+                  <w:rStyle w:val="VerbatimChar"/>
+                </w:rPr>
+                <w:t xml:space="preserve">c226841</w:t>
+              </w:r>
+            </w:hyperlink>
+          </w:p>
+        </w:tc>
+        <w:tc>
+          <w:tcPr/>
+          <w:p>
+            <w:pPr>
+              <w:pStyle w:val="Compact"/>
+            </w:pPr>
+            <w:r>
+              <w:t xml:space="preserve">Milestone tags retargeted to</w:t>
+            </w:r>
+            <w:r>
+              <w:t xml:space="preserve"> </w:t>
+            </w:r>
+            <w:r>
+              <w:rPr>
+                <w:rStyle w:val="VerbatimChar"/>
+              </w:rPr>
+              <w:t xml:space="preserve">main</w:t>
+            </w:r>
+            <w:r>
+              <w:t xml:space="preserve">, deliverable status refreshed, and release metadata added</w:t>
             </w:r>
           </w:p>
         </w:tc>

</xml_diff>

<commit_message>
Document regenerated n10000 benchmark workflow
</commit_message>
<xml_diff>
--- a/docs/deliverables/Evidence_Index.docx
+++ b/docs/deliverables/Evidence_Index.docx
@@ -2033,7 +2033,52 @@
               </w:r>
             </w:hyperlink>
             <w:r>
-              <w:t xml:space="preserve">,</w:t>
+              <w:t xml:space="preserve"> </w:t>
+            </w:r>
+            <w:r>
+              <w:t xml:space="preserve">(</w:t>
+            </w:r>
+            <w:r>
+              <w:rPr>
+                <w:rStyle w:val="VerbatimChar"/>
+              </w:rPr>
+              <w:t xml:space="preserve">n500</w:t>
+            </w:r>
+            <w:r>
+              <w:t xml:space="preserve"> </w:t>
+            </w:r>
+            <w:r>
+              <w:t xml:space="preserve">and</w:t>
+            </w:r>
+            <w:r>
+              <w:t xml:space="preserve"> </w:t>
+            </w:r>
+            <w:r>
+              <w:rPr>
+                <w:rStyle w:val="VerbatimChar"/>
+              </w:rPr>
+              <w:t xml:space="preserve">n2000</w:t>
+            </w:r>
+            <w:r>
+              <w:t xml:space="preserve"> </w:t>
+            </w:r>
+            <w:r>
+              <w:t xml:space="preserve">tracked;</w:t>
+            </w:r>
+            <w:r>
+              <w:t xml:space="preserve"> </w:t>
+            </w:r>
+            <w:r>
+              <w:rPr>
+                <w:rStyle w:val="VerbatimChar"/>
+              </w:rPr>
+              <w:t xml:space="preserve">n10000</w:t>
+            </w:r>
+            <w:r>
+              <w:t xml:space="preserve"> </w:t>
+            </w:r>
+            <w:r>
+              <w:t xml:space="preserve">regenerated from the README command),</w:t>
             </w:r>
             <w:r>
               <w:t xml:space="preserve"> </w:t>

</xml_diff>

<commit_message>
Point the submission package tag at the current deliverables
The tag previously marked a commit predating the cover pages and the
document style pass. It now marks the commit that carries both, and the
evidence index records the new target.
</commit_message>
<xml_diff>
--- a/docs/deliverables/Evidence_Index.docx
+++ b/docs/deliverables/Evidence_Index.docx
@@ -182,7 +182,7 @@
       </w:r>
     </w:p>
     <w:bookmarkEnd w:id="9"/>
-    <w:bookmarkStart w:id="52" w:name="milestones-with-proof"/>
+    <w:bookmarkStart w:id="53" w:name="milestones-with-proof"/>
     <w:p>
       <w:pPr>
         <w:pStyle w:val="Heading1"/>
@@ -1101,6 +1101,20 @@
                 <w:t xml:space="preserve">c226841</w:t>
               </w:r>
             </w:hyperlink>
+            <w:r>
+              <w:t xml:space="preserve">,</w:t>
+            </w:r>
+            <w:r>
+              <w:t xml:space="preserve"> </w:t>
+            </w:r>
+            <w:hyperlink r:id="rId46">
+              <w:r>
+                <w:rPr>
+                  <w:rStyle w:val="VerbatimChar"/>
+                </w:rPr>
+                <w:t xml:space="preserve">29dab58</w:t>
+              </w:r>
+            </w:hyperlink>
           </w:p>
         </w:tc>
         <w:tc>
@@ -1123,7 +1137,7 @@
             <w:r>
               <w:t xml:space="preserve"> </w:t>
             </w:r>
-            <w:hyperlink r:id="rId46">
+            <w:hyperlink r:id="rId47">
               <w:r>
                 <w:rPr>
                   <w:rStyle w:val="VerbatimChar"/>
@@ -1207,7 +1221,7 @@
             <w:r>
               <w:t xml:space="preserve"> </w:t>
             </w:r>
-            <w:hyperlink r:id="rId47">
+            <w:hyperlink r:id="rId48">
               <w:r>
                 <w:rPr>
                   <w:rStyle w:val="VerbatimChar"/>
@@ -1221,7 +1235,7 @@
             <w:r>
               <w:t xml:space="preserve"> </w:t>
             </w:r>
-            <w:hyperlink r:id="rId48">
+            <w:hyperlink r:id="rId49">
               <w:r>
                 <w:rPr>
                   <w:rStyle w:val="VerbatimChar"/>
@@ -1251,7 +1265,7 @@
             <w:r>
               <w:t xml:space="preserve"> </w:t>
             </w:r>
-            <w:hyperlink r:id="rId49">
+            <w:hyperlink r:id="rId50">
               <w:r>
                 <w:rPr>
                   <w:rStyle w:val="VerbatimChar"/>
@@ -1321,27 +1335,27 @@
             <w:r>
               <w:t xml:space="preserve"> </w:t>
             </w:r>
+            <w:hyperlink r:id="rId51">
+              <w:r>
+                <w:rPr>
+                  <w:rStyle w:val="VerbatimChar"/>
+                </w:rPr>
+                <w:t xml:space="preserve">583ef94</w:t>
+              </w:r>
+            </w:hyperlink>
+          </w:p>
+        </w:tc>
+        <w:tc>
+          <w:tcPr/>
+          <w:p>
+            <w:pPr>
+              <w:pStyle w:val="Compact"/>
+            </w:pPr>
             <w:hyperlink r:id="rId50">
               <w:r>
                 <w:rPr>
                   <w:rStyle w:val="VerbatimChar"/>
                 </w:rPr>
-                <w:t xml:space="preserve">583ef94</w:t>
-              </w:r>
-            </w:hyperlink>
-          </w:p>
-        </w:tc>
-        <w:tc>
-          <w:tcPr/>
-          <w:p>
-            <w:pPr>
-              <w:pStyle w:val="Compact"/>
-            </w:pPr>
-            <w:hyperlink r:id="rId49">
-              <w:r>
-                <w:rPr>
-                  <w:rStyle w:val="VerbatimChar"/>
-                </w:rPr>
                 <w:t xml:space="preserve">docs/deliverables/</w:t>
               </w:r>
             </w:hyperlink>
@@ -1351,7 +1365,7 @@
             <w:r>
               <w:t xml:space="preserve"> </w:t>
             </w:r>
-            <w:hyperlink r:id="rId51">
+            <w:hyperlink r:id="rId52">
               <w:r>
                 <w:rPr>
                   <w:rStyle w:val="VerbatimChar"/>
@@ -1363,8 +1377,8 @@
         </w:tc>
       </w:tr>
     </w:tbl>
-    <w:bookmarkEnd w:id="52"/>
-    <w:bookmarkStart w:id="54" w:name="what-each-tag-points-at"/>
+    <w:bookmarkEnd w:id="53"/>
+    <w:bookmarkStart w:id="55" w:name="what-each-tag-points-at"/>
     <w:p>
       <w:pPr>
         <w:pStyle w:val="Heading1"/>
@@ -1688,7 +1702,7 @@
             <w:pPr>
               <w:pStyle w:val="Compact"/>
             </w:pPr>
-            <w:hyperlink r:id="rId53">
+            <w:hyperlink r:id="rId54">
               <w:r>
                 <w:rPr>
                   <w:rStyle w:val="VerbatimChar"/>
@@ -1753,35 +1767,35 @@
             <w:pPr>
               <w:pStyle w:val="Compact"/>
             </w:pPr>
-            <w:hyperlink r:id="rId45">
-              <w:r>
-                <w:rPr>
-                  <w:rStyle w:val="VerbatimChar"/>
-                </w:rPr>
-                <w:t xml:space="preserve">c226841</w:t>
-              </w:r>
-            </w:hyperlink>
-          </w:p>
-        </w:tc>
-        <w:tc>
-          <w:tcPr/>
-          <w:p>
-            <w:pPr>
-              <w:pStyle w:val="Compact"/>
-            </w:pPr>
-            <w:r>
-              <w:t xml:space="preserve">01/09/2026</w:t>
-            </w:r>
-          </w:p>
-        </w:tc>
-        <w:tc>
-          <w:tcPr/>
-          <w:p>
-            <w:pPr>
-              <w:pStyle w:val="Compact"/>
-            </w:pPr>
-            <w:r>
-              <w:t xml:space="preserve">Final report draft, all Word deliverables, the presentation, the tracker, this index, the AI usage log, release metadata, and the completed validation report included</w:t>
+            <w:hyperlink r:id="rId46">
+              <w:r>
+                <w:rPr>
+                  <w:rStyle w:val="VerbatimChar"/>
+                </w:rPr>
+                <w:t xml:space="preserve">29dab58</w:t>
+              </w:r>
+            </w:hyperlink>
+          </w:p>
+        </w:tc>
+        <w:tc>
+          <w:tcPr/>
+          <w:p>
+            <w:pPr>
+              <w:pStyle w:val="Compact"/>
+            </w:pPr>
+            <w:r>
+              <w:t xml:space="preserve">02/09/2026</w:t>
+            </w:r>
+          </w:p>
+        </w:tc>
+        <w:tc>
+          <w:tcPr/>
+          <w:p>
+            <w:pPr>
+              <w:pStyle w:val="Compact"/>
+            </w:pPr>
+            <w:r>
+              <w:t xml:space="preserve">Final report draft, all Word deliverables on a single document style with cover pages on the report, validation report and format guide, the presentation, the tracker, this index, the AI usage log, release metadata, and the completed validation report</w:t>
             </w:r>
           </w:p>
         </w:tc>
@@ -1857,8 +1871,8 @@
         <w:t xml:space="preserve">29/09/2026 date and appear to be duplicates; this is queried with the supervisor.</w:t>
       </w:r>
     </w:p>
-    <w:bookmarkEnd w:id="54"/>
-    <w:bookmarkStart w:id="67" w:name="X343555567a2f7f017c0602652a29739aa6e8b64"/>
+    <w:bookmarkEnd w:id="55"/>
+    <w:bookmarkStart w:id="68" w:name="X343555567a2f7f017c0602652a29739aa6e8b64"/>
     <w:p>
       <w:pPr>
         <w:pStyle w:val="Heading1"/>
@@ -1951,7 +1965,7 @@
             <w:r>
               <w:t xml:space="preserve"> </w:t>
             </w:r>
-            <w:hyperlink r:id="rId55">
+            <w:hyperlink r:id="rId56">
               <w:r>
                 <w:rPr>
                   <w:rStyle w:val="VerbatimChar"/>
@@ -1980,7 +1994,7 @@
             <w:pPr>
               <w:pStyle w:val="Compact"/>
             </w:pPr>
-            <w:hyperlink r:id="rId56">
+            <w:hyperlink r:id="rId57">
               <w:r>
                 <w:rPr>
                   <w:rStyle w:val="VerbatimChar"/>
@@ -1994,7 +2008,7 @@
             <w:r>
               <w:t xml:space="preserve"> </w:t>
             </w:r>
-            <w:hyperlink r:id="rId57">
+            <w:hyperlink r:id="rId58">
               <w:r>
                 <w:rPr>
                   <w:rStyle w:val="Hyperlink"/>
@@ -2023,7 +2037,7 @@
             <w:pPr>
               <w:pStyle w:val="Compact"/>
             </w:pPr>
-            <w:hyperlink r:id="rId58">
+            <w:hyperlink r:id="rId59">
               <w:r>
                 <w:rPr>
                   <w:rStyle w:val="VerbatimChar"/>
@@ -2082,7 +2096,7 @@
             <w:r>
               <w:t xml:space="preserve"> </w:t>
             </w:r>
-            <w:hyperlink r:id="rId59">
+            <w:hyperlink r:id="rId60">
               <w:r>
                 <w:rPr>
                   <w:rStyle w:val="VerbatimChar"/>
@@ -2125,7 +2139,7 @@
             <w:r>
               <w:t xml:space="preserve"> </w:t>
             </w:r>
-            <w:hyperlink r:id="rId60">
+            <w:hyperlink r:id="rId61">
               <w:r>
                 <w:rPr>
                   <w:rStyle w:val="Hyperlink"/>
@@ -2168,7 +2182,7 @@
             <w:r>
               <w:t xml:space="preserve"> </w:t>
             </w:r>
-            <w:hyperlink r:id="rId46">
+            <w:hyperlink r:id="rId47">
               <w:r>
                 <w:rPr>
                   <w:rStyle w:val="Hyperlink"/>
@@ -2197,7 +2211,7 @@
             <w:pPr>
               <w:pStyle w:val="Compact"/>
             </w:pPr>
-            <w:hyperlink r:id="rId61">
+            <w:hyperlink r:id="rId62">
               <w:r>
                 <w:rPr>
                   <w:rStyle w:val="VerbatimChar"/>
@@ -2226,7 +2240,7 @@
             <w:pPr>
               <w:pStyle w:val="Compact"/>
             </w:pPr>
-            <w:hyperlink r:id="rId62">
+            <w:hyperlink r:id="rId63">
               <w:r>
                 <w:rPr>
                   <w:rStyle w:val="VerbatimChar"/>
@@ -2240,7 +2254,7 @@
             <w:r>
               <w:t xml:space="preserve"> </w:t>
             </w:r>
-            <w:hyperlink r:id="rId63">
+            <w:hyperlink r:id="rId64">
               <w:r>
                 <w:rPr>
                   <w:rStyle w:val="Hyperlink"/>
@@ -2269,7 +2283,7 @@
             <w:pPr>
               <w:pStyle w:val="Compact"/>
             </w:pPr>
-            <w:hyperlink r:id="rId64">
+            <w:hyperlink r:id="rId65">
               <w:r>
                 <w:rPr>
                   <w:rStyle w:val="VerbatimChar"/>
@@ -2283,7 +2297,7 @@
             <w:r>
               <w:t xml:space="preserve"> </w:t>
             </w:r>
-            <w:hyperlink r:id="rId65">
+            <w:hyperlink r:id="rId66">
               <w:r>
                 <w:rPr>
                   <w:rStyle w:val="VerbatimChar"/>
@@ -2297,7 +2311,7 @@
             <w:r>
               <w:t xml:space="preserve"> </w:t>
             </w:r>
-            <w:hyperlink r:id="rId66">
+            <w:hyperlink r:id="rId67">
               <w:r>
                 <w:rPr>
                   <w:rStyle w:val="VerbatimChar"/>
@@ -2309,8 +2323,8 @@
         </w:tc>
       </w:tr>
     </w:tbl>
-    <w:bookmarkEnd w:id="67"/>
-    <w:bookmarkStart w:id="68" w:name="key-commits-what-each-one-proves"/>
+    <w:bookmarkEnd w:id="68"/>
+    <w:bookmarkStart w:id="69" w:name="key-commits-what-each-one-proves"/>
     <w:p>
       <w:pPr>
         <w:pStyle w:val="Heading1"/>
@@ -2625,7 +2639,7 @@
             <w:pPr>
               <w:pStyle w:val="Compact"/>
             </w:pPr>
-            <w:hyperlink r:id="rId48">
+            <w:hyperlink r:id="rId49">
               <w:r>
                 <w:rPr>
                   <w:rStyle w:val="VerbatimChar"/>
@@ -2697,7 +2711,7 @@
         <w:t xml:space="preserve">Links resolve for anyone with access to the repository. To confirm a single point live, open the commits page and read the message and changed files for the hash named above.</w:t>
       </w:r>
     </w:p>
-    <w:bookmarkEnd w:id="68"/>
+    <w:bookmarkEnd w:id="69"/>
     <w:sectPr>
       <w:footnotePr>
         <w:numRestart w:val="eachSect"/>

</xml_diff>

<commit_message>
Rebuild the Word and PDF deliverables with measured page numbers
The contents list and the lists of tables and figures carried placeholders for
the new sections and tables. scripts/paginate_report.py measures the real page
numbers by building the document, exporting it through Word and reading back
the page each heading and caption starts on; the numbers stabilised after two
rounds. The report is 88 pages.

The table fitter failed on any deliverable whose reference document carries no
explicit page geometry, because python-docx reports None and the width
arithmetic then fails. It now falls back to the geometry the other deliverables
use, so all five deliverables rebuild.
</commit_message>
<xml_diff>
--- a/docs/deliverables/Evidence_Index.docx
+++ b/docs/deliverables/Evidence_Index.docx
@@ -73,7 +73,7 @@
         <w:t xml:space="preserve"> </w:t>
       </w:r>
       <w:r>
-        <w:t xml:space="preserve">Mr. Mofya Phiri</w:t>
+        <w:t xml:space="preserve">Mr. Mofya Phiri</w:t>
       </w:r>
       <w:r>
         <w:br/>
@@ -88,8 +88,19 @@
       <w:r>
         <w:t xml:space="preserve"> </w:t>
       </w:r>
-      <w:r>
-        <w:t xml:space="preserve">https://github.com/Samuelkaoma-eng/SKACE-TIME-DATA (branch</w:t>
+      <w:hyperlink r:id="rId9">
+        <w:r>
+          <w:rPr>
+            <w:rStyle w:val="Hyperlink"/>
+          </w:rPr>
+          <w:t xml:space="preserve">https://github.com/Samuelkaoma-eng/SKACE-TIME-DATA</w:t>
+        </w:r>
+      </w:hyperlink>
+      <w:r>
+        <w:t xml:space="preserve"> </w:t>
+      </w:r>
+      <w:r>
+        <w:t xml:space="preserve">(branch</w:t>
       </w:r>
       <w:r>
         <w:t xml:space="preserve"> </w:t>
@@ -112,7 +123,7 @@
         <w:t xml:space="preserve">One page that maps every milestone and deliverable to its proof in the repository. Each link opens either a file or the exact commit that produced it.</w:t>
       </w:r>
     </w:p>
-    <w:bookmarkStart w:id="9" w:name="point-at-everything-links"/>
+    <w:bookmarkStart w:id="15" w:name="point-at-everything-links"/>
     <w:p>
       <w:pPr>
         <w:pStyle w:val="Heading1"/>
@@ -130,8 +141,19 @@
         </w:numPr>
       </w:pPr>
       <w:r>
-        <w:t xml:space="preserve">Full commit history: https://github.com/Samuelkaoma-eng/SKACE-TIME-DATA/commits/main</w:t>
-      </w:r>
+        <w:t xml:space="preserve">Full commit history:</w:t>
+      </w:r>
+      <w:r>
+        <w:t xml:space="preserve"> </w:t>
+      </w:r>
+      <w:hyperlink r:id="rId10">
+        <w:r>
+          <w:rPr>
+            <w:rStyle w:val="Hyperlink"/>
+          </w:rPr>
+          <w:t xml:space="preserve">https://github.com/Samuelkaoma-eng/SKACE-TIME-DATA/commits/main</w:t>
+        </w:r>
+      </w:hyperlink>
     </w:p>
     <w:p>
       <w:pPr>
@@ -142,8 +164,19 @@
         </w:numPr>
       </w:pPr>
       <w:r>
-        <w:t xml:space="preserve">Source code: https://github.com/Samuelkaoma-eng/SKACE-TIME-DATA/tree/main/src</w:t>
-      </w:r>
+        <w:t xml:space="preserve">Source code:</w:t>
+      </w:r>
+      <w:r>
+        <w:t xml:space="preserve"> </w:t>
+      </w:r>
+      <w:hyperlink r:id="rId11">
+        <w:r>
+          <w:rPr>
+            <w:rStyle w:val="Hyperlink"/>
+          </w:rPr>
+          <w:t xml:space="preserve">https://github.com/Samuelkaoma-eng/SKACE-TIME-DATA/tree/main/src</w:t>
+        </w:r>
+      </w:hyperlink>
     </w:p>
     <w:p>
       <w:pPr>
@@ -154,8 +187,19 @@
         </w:numPr>
       </w:pPr>
       <w:r>
-        <w:t xml:space="preserve">Tests: https://github.com/Samuelkaoma-eng/SKACE-TIME-DATA/tree/main/tests</w:t>
-      </w:r>
+        <w:t xml:space="preserve">Tests:</w:t>
+      </w:r>
+      <w:r>
+        <w:t xml:space="preserve"> </w:t>
+      </w:r>
+      <w:hyperlink r:id="rId12">
+        <w:r>
+          <w:rPr>
+            <w:rStyle w:val="Hyperlink"/>
+          </w:rPr>
+          <w:t xml:space="preserve">https://github.com/Samuelkaoma-eng/SKACE-TIME-DATA/tree/main/tests</w:t>
+        </w:r>
+      </w:hyperlink>
     </w:p>
     <w:p>
       <w:pPr>
@@ -166,8 +210,19 @@
         </w:numPr>
       </w:pPr>
       <w:r>
-        <w:t xml:space="preserve">Official documents (Word): https://github.com/Samuelkaoma-eng/SKACE-TIME-DATA/tree/main/docs/deliverables</w:t>
-      </w:r>
+        <w:t xml:space="preserve">Official documents (Word):</w:t>
+      </w:r>
+      <w:r>
+        <w:t xml:space="preserve"> </w:t>
+      </w:r>
+      <w:hyperlink r:id="rId13">
+        <w:r>
+          <w:rPr>
+            <w:rStyle w:val="Hyperlink"/>
+          </w:rPr>
+          <w:t xml:space="preserve">https://github.com/Samuelkaoma-eng/SKACE-TIME-DATA/tree/main/docs/deliverables</w:t>
+        </w:r>
+      </w:hyperlink>
     </w:p>
     <w:p>
       <w:pPr>
@@ -178,11 +233,22 @@
         </w:numPr>
       </w:pPr>
       <w:r>
-        <w:t xml:space="preserve">Milestone tracker: https://github.com/Samuelkaoma-eng/SKACE-TIME-DATA/blob/main/docs/milestone_tracker.md</w:t>
-      </w:r>
+        <w:t xml:space="preserve">Milestone tracker:</w:t>
+      </w:r>
+      <w:r>
+        <w:t xml:space="preserve"> </w:t>
+      </w:r>
+      <w:hyperlink r:id="rId14">
+        <w:r>
+          <w:rPr>
+            <w:rStyle w:val="Hyperlink"/>
+          </w:rPr>
+          <w:t xml:space="preserve">https://github.com/Samuelkaoma-eng/SKACE-TIME-DATA/blob/main/docs/milestone_tracker.md</w:t>
+        </w:r>
+      </w:hyperlink>
     </w:p>
-    <w:bookmarkEnd w:id="9"/>
-    <w:bookmarkStart w:id="53" w:name="milestones-with-proof"/>
+    <w:bookmarkEnd w:id="15"/>
+    <w:bookmarkStart w:id="55" w:name="milestones-with-proof"/>
     <w:p>
       <w:pPr>
         <w:pStyle w:val="Heading1"/>
@@ -202,72 +268,101 @@
     <w:tbl>
       <w:tblPr>
         <w:tblStyle w:val="Table"/>
-        <w:tblW w:type="pct" w:w="5000"/>
-        <w:tblLayout w:type="fixed"/>
+        <w:tblW w:type="auto" w:w="0"/>
         <w:tblLook w:firstRow="1" w:lastRow="0" w:firstColumn="0" w:lastColumn="0" w:noHBand="0" w:noVBand="0" w:val="0020"/>
       </w:tblPr>
       <w:tblGrid>
-        <w:gridCol w:w="1584"/>
-        <w:gridCol w:w="1584"/>
-        <w:gridCol w:w="1584"/>
-        <w:gridCol w:w="1584"/>
-        <w:gridCol w:w="1584"/>
+        <w:gridCol w:w="1875"/>
+        <w:gridCol w:w="1497"/>
+        <w:gridCol w:w="1996"/>
+        <w:gridCol w:w="1996"/>
+        <w:gridCol w:w="1996"/>
       </w:tblGrid>
       <w:tr>
         <w:trPr>
           <w:tblHeader w:val="on"/>
         </w:trPr>
         <w:tc>
-          <w:tcPr/>
-          <w:p>
-            <w:pPr>
-              <w:pStyle w:val="Compact"/>
-            </w:pPr>
-            <w:r>
+          <w:tcPr>
+            <w:tcW w:type="dxa" w:w="1875"/>
+          </w:tcPr>
+          <w:p>
+            <w:pPr>
+              <w:pStyle w:val="Compact"/>
+              <w:jc w:val="left"/>
+            </w:pPr>
+            <w:r>
+              <w:rPr>
+                <w:sz w:val="21"/>
+              </w:rPr>
               <w:t xml:space="preserve">Milestone</w:t>
             </w:r>
           </w:p>
         </w:tc>
         <w:tc>
-          <w:tcPr/>
-          <w:p>
-            <w:pPr>
-              <w:pStyle w:val="Compact"/>
-            </w:pPr>
-            <w:r>
+          <w:tcPr>
+            <w:tcW w:type="dxa" w:w="1497"/>
+          </w:tcPr>
+          <w:p>
+            <w:pPr>
+              <w:pStyle w:val="Compact"/>
+              <w:jc w:val="left"/>
+            </w:pPr>
+            <w:r>
+              <w:rPr>
+                <w:sz w:val="21"/>
+              </w:rPr>
               <w:t xml:space="preserve">Due</w:t>
             </w:r>
           </w:p>
         </w:tc>
         <w:tc>
-          <w:tcPr/>
-          <w:p>
-            <w:pPr>
-              <w:pStyle w:val="Compact"/>
-            </w:pPr>
-            <w:r>
+          <w:tcPr>
+            <w:tcW w:type="dxa" w:w="1996"/>
+          </w:tcPr>
+          <w:p>
+            <w:pPr>
+              <w:pStyle w:val="Compact"/>
+              <w:jc w:val="left"/>
+            </w:pPr>
+            <w:r>
+              <w:rPr>
+                <w:sz w:val="21"/>
+              </w:rPr>
               <w:t xml:space="preserve">Tag</w:t>
             </w:r>
           </w:p>
         </w:tc>
         <w:tc>
-          <w:tcPr/>
-          <w:p>
-            <w:pPr>
-              <w:pStyle w:val="Compact"/>
-            </w:pPr>
-            <w:r>
+          <w:tcPr>
+            <w:tcW w:type="dxa" w:w="1996"/>
+          </w:tcPr>
+          <w:p>
+            <w:pPr>
+              <w:pStyle w:val="Compact"/>
+              <w:jc w:val="left"/>
+            </w:pPr>
+            <w:r>
+              <w:rPr>
+                <w:sz w:val="21"/>
+              </w:rPr>
               <w:t xml:space="preserve">Proof: commits</w:t>
             </w:r>
           </w:p>
         </w:tc>
         <w:tc>
-          <w:tcPr/>
-          <w:p>
-            <w:pPr>
-              <w:pStyle w:val="Compact"/>
-            </w:pPr>
-            <w:r>
+          <w:tcPr>
+            <w:tcW w:type="dxa" w:w="1996"/>
+          </w:tcPr>
+          <w:p>
+            <w:pPr>
+              <w:pStyle w:val="Compact"/>
+              <w:jc w:val="left"/>
+            </w:pPr>
+            <w:r>
+              <w:rPr>
+                <w:sz w:val="21"/>
+              </w:rPr>
               <w:t xml:space="preserve">Proof: files</w:t>
             </w:r>
           </w:p>
@@ -275,34 +370,49 @@
       </w:tr>
       <w:tr>
         <w:tc>
-          <w:tcPr/>
-          <w:p>
-            <w:pPr>
-              <w:pStyle w:val="Compact"/>
-            </w:pPr>
-            <w:r>
+          <w:tcPr>
+            <w:tcW w:type="dxa" w:w="1875"/>
+          </w:tcPr>
+          <w:p>
+            <w:pPr>
+              <w:pStyle w:val="Compact"/>
+              <w:jc w:val="left"/>
+            </w:pPr>
+            <w:r>
+              <w:rPr>
+                <w:sz w:val="21"/>
+              </w:rPr>
               <w:t xml:space="preserve">Proposal</w:t>
             </w:r>
           </w:p>
         </w:tc>
         <w:tc>
-          <w:tcPr/>
-          <w:p>
-            <w:pPr>
-              <w:pStyle w:val="Compact"/>
-            </w:pPr>
-            <w:r>
+          <w:tcPr>
+            <w:tcW w:type="dxa" w:w="1497"/>
+          </w:tcPr>
+          <w:p>
+            <w:pPr>
+              <w:pStyle w:val="Compact"/>
+              <w:jc w:val="left"/>
+            </w:pPr>
+            <w:r>
+              <w:rPr>
+                <w:sz w:val="21"/>
+              </w:rPr>
               <w:t xml:space="preserve">14/04/2026</w:t>
             </w:r>
           </w:p>
         </w:tc>
         <w:tc>
-          <w:tcPr/>
-          <w:p>
-            <w:pPr>
-              <w:pStyle w:val="Compact"/>
-            </w:pPr>
-            <w:hyperlink r:id="rId10">
+          <w:tcPr>
+            <w:tcW w:type="dxa" w:w="1996"/>
+          </w:tcPr>
+          <w:p>
+            <w:pPr>
+              <w:pStyle w:val="Compact"/>
+              <w:jc w:val="left"/>
+            </w:pPr>
+            <w:hyperlink r:id="rId16">
               <w:r>
                 <w:rPr>
                   <w:rStyle w:val="VerbatimChar"/>
@@ -313,12 +423,15 @@
           </w:p>
         </w:tc>
         <w:tc>
-          <w:tcPr/>
-          <w:p>
-            <w:pPr>
-              <w:pStyle w:val="Compact"/>
-            </w:pPr>
-            <w:hyperlink r:id="rId11">
+          <w:tcPr>
+            <w:tcW w:type="dxa" w:w="1996"/>
+          </w:tcPr>
+          <w:p>
+            <w:pPr>
+              <w:pStyle w:val="Compact"/>
+              <w:jc w:val="left"/>
+            </w:pPr>
+            <w:hyperlink r:id="rId17">
               <w:r>
                 <w:rPr>
                   <w:rStyle w:val="VerbatimChar"/>
@@ -329,27 +442,40 @@
           </w:p>
         </w:tc>
         <w:tc>
-          <w:tcPr/>
-          <w:p>
-            <w:pPr>
-              <w:pStyle w:val="Compact"/>
+          <w:tcPr>
+            <w:tcW w:type="dxa" w:w="1996"/>
+          </w:tcPr>
+          <w:p>
+            <w:pPr>
+              <w:pStyle w:val="Compact"/>
+              <w:jc w:val="left"/>
             </w:pPr>
             <w:r>
               <w:rPr>
                 <w:rStyle w:val="VerbatimChar"/>
+                <w:sz w:val="21"/>
               </w:rPr>
               <w:t xml:space="preserve">docs/deliverables/SAMUEL KAOMA 2022016530 V4.pdf</w:t>
             </w:r>
             <w:r>
-              <w:t xml:space="preserve"> </w:t>
-            </w:r>
-            <w:r>
+              <w:rPr>
+                <w:sz w:val="21"/>
+              </w:rPr>
+              <w:t xml:space="preserve"> </w:t>
+            </w:r>
+            <w:r>
+              <w:rPr>
+                <w:sz w:val="21"/>
+              </w:rPr>
               <w:t xml:space="preserve">(submitted 26 March 2026),</w:t>
             </w:r>
             <w:r>
-              <w:t xml:space="preserve"> </w:t>
-            </w:r>
-            <w:hyperlink r:id="rId12">
+              <w:rPr>
+                <w:sz w:val="21"/>
+              </w:rPr>
+              <w:t xml:space="preserve"> </w:t>
+            </w:r>
+            <w:hyperlink r:id="rId18">
               <w:r>
                 <w:rPr>
                   <w:rStyle w:val="VerbatimChar"/>
@@ -362,34 +488,49 @@
       </w:tr>
       <w:tr>
         <w:tc>
-          <w:tcPr/>
-          <w:p>
-            <w:pPr>
-              <w:pStyle w:val="Compact"/>
-            </w:pPr>
-            <w:r>
+          <w:tcPr>
+            <w:tcW w:type="dxa" w:w="1875"/>
+          </w:tcPr>
+          <w:p>
+            <w:pPr>
+              <w:pStyle w:val="Compact"/>
+              <w:jc w:val="left"/>
+            </w:pPr>
+            <w:r>
+              <w:rPr>
+                <w:sz w:val="21"/>
+              </w:rPr>
               <w:t xml:space="preserve">Prototype</w:t>
             </w:r>
           </w:p>
         </w:tc>
         <w:tc>
-          <w:tcPr/>
-          <w:p>
-            <w:pPr>
-              <w:pStyle w:val="Compact"/>
-            </w:pPr>
-            <w:r>
+          <w:tcPr>
+            <w:tcW w:type="dxa" w:w="1497"/>
+          </w:tcPr>
+          <w:p>
+            <w:pPr>
+              <w:pStyle w:val="Compact"/>
+              <w:jc w:val="left"/>
+            </w:pPr>
+            <w:r>
+              <w:rPr>
+                <w:sz w:val="21"/>
+              </w:rPr>
               <w:t xml:space="preserve">09/06/2026</w:t>
             </w:r>
           </w:p>
         </w:tc>
         <w:tc>
-          <w:tcPr/>
-          <w:p>
-            <w:pPr>
-              <w:pStyle w:val="Compact"/>
-            </w:pPr>
-            <w:hyperlink r:id="rId13">
+          <w:tcPr>
+            <w:tcW w:type="dxa" w:w="1996"/>
+          </w:tcPr>
+          <w:p>
+            <w:pPr>
+              <w:pStyle w:val="Compact"/>
+              <w:jc w:val="left"/>
+            </w:pPr>
+            <w:hyperlink r:id="rId19">
               <w:r>
                 <w:rPr>
                   <w:rStyle w:val="VerbatimChar"/>
@@ -400,12 +541,15 @@
           </w:p>
         </w:tc>
         <w:tc>
-          <w:tcPr/>
-          <w:p>
-            <w:pPr>
-              <w:pStyle w:val="Compact"/>
-            </w:pPr>
-            <w:hyperlink r:id="rId14">
+          <w:tcPr>
+            <w:tcW w:type="dxa" w:w="1996"/>
+          </w:tcPr>
+          <w:p>
+            <w:pPr>
+              <w:pStyle w:val="Compact"/>
+              <w:jc w:val="left"/>
+            </w:pPr>
+            <w:hyperlink r:id="rId20">
               <w:r>
                 <w:rPr>
                   <w:rStyle w:val="VerbatimChar"/>
@@ -414,12 +558,18 @@
               </w:r>
             </w:hyperlink>
             <w:r>
+              <w:rPr>
+                <w:sz w:val="21"/>
+              </w:rPr>
               <w:t xml:space="preserve">,</w:t>
             </w:r>
             <w:r>
-              <w:t xml:space="preserve"> </w:t>
-            </w:r>
-            <w:hyperlink r:id="rId15">
+              <w:rPr>
+                <w:sz w:val="21"/>
+              </w:rPr>
+              <w:t xml:space="preserve"> </w:t>
+            </w:r>
+            <w:hyperlink r:id="rId21">
               <w:r>
                 <w:rPr>
                   <w:rStyle w:val="VerbatimChar"/>
@@ -428,12 +578,18 @@
               </w:r>
             </w:hyperlink>
             <w:r>
+              <w:rPr>
+                <w:sz w:val="21"/>
+              </w:rPr>
               <w:t xml:space="preserve">,</w:t>
             </w:r>
             <w:r>
-              <w:t xml:space="preserve"> </w:t>
-            </w:r>
-            <w:hyperlink r:id="rId16">
+              <w:rPr>
+                <w:sz w:val="21"/>
+              </w:rPr>
+              <w:t xml:space="preserve"> </w:t>
+            </w:r>
+            <w:hyperlink r:id="rId22">
               <w:r>
                 <w:rPr>
                   <w:rStyle w:val="VerbatimChar"/>
@@ -444,12 +600,15 @@
           </w:p>
         </w:tc>
         <w:tc>
-          <w:tcPr/>
-          <w:p>
-            <w:pPr>
-              <w:pStyle w:val="Compact"/>
-            </w:pPr>
-            <w:hyperlink r:id="rId17">
+          <w:tcPr>
+            <w:tcW w:type="dxa" w:w="1996"/>
+          </w:tcPr>
+          <w:p>
+            <w:pPr>
+              <w:pStyle w:val="Compact"/>
+              <w:jc w:val="left"/>
+            </w:pPr>
+            <w:hyperlink r:id="rId11">
               <w:r>
                 <w:rPr>
                   <w:rStyle w:val="VerbatimChar"/>
@@ -458,12 +617,18 @@
               </w:r>
             </w:hyperlink>
             <w:r>
+              <w:rPr>
+                <w:sz w:val="21"/>
+              </w:rPr>
               <w:t xml:space="preserve">,</w:t>
             </w:r>
             <w:r>
-              <w:t xml:space="preserve"> </w:t>
-            </w:r>
-            <w:hyperlink r:id="rId18">
+              <w:rPr>
+                <w:sz w:val="21"/>
+              </w:rPr>
+              <w:t xml:space="preserve"> </w:t>
+            </w:r>
+            <w:hyperlink r:id="rId23">
               <w:r>
                 <w:rPr>
                   <w:rStyle w:val="VerbatimChar"/>
@@ -472,12 +637,18 @@
               </w:r>
             </w:hyperlink>
             <w:r>
+              <w:rPr>
+                <w:sz w:val="21"/>
+              </w:rPr>
               <w:t xml:space="preserve">,</w:t>
             </w:r>
             <w:r>
-              <w:t xml:space="preserve"> </w:t>
-            </w:r>
-            <w:hyperlink r:id="rId19">
+              <w:rPr>
+                <w:sz w:val="21"/>
+              </w:rPr>
+              <w:t xml:space="preserve"> </w:t>
+            </w:r>
+            <w:hyperlink r:id="rId24">
               <w:r>
                 <w:rPr>
                   <w:rStyle w:val="VerbatimChar"/>
@@ -490,34 +661,49 @@
       </w:tr>
       <w:tr>
         <w:tc>
-          <w:tcPr/>
-          <w:p>
-            <w:pPr>
-              <w:pStyle w:val="Compact"/>
-            </w:pPr>
-            <w:r>
+          <w:tcPr>
+            <w:tcW w:type="dxa" w:w="1875"/>
+          </w:tcPr>
+          <w:p>
+            <w:pPr>
+              <w:pStyle w:val="Compact"/>
+              <w:jc w:val="left"/>
+            </w:pPr>
+            <w:r>
+              <w:rPr>
+                <w:sz w:val="21"/>
+              </w:rPr>
               <w:t xml:space="preserve">Proposal and literature review</w:t>
             </w:r>
           </w:p>
         </w:tc>
         <w:tc>
-          <w:tcPr/>
-          <w:p>
-            <w:pPr>
-              <w:pStyle w:val="Compact"/>
-            </w:pPr>
-            <w:r>
+          <w:tcPr>
+            <w:tcW w:type="dxa" w:w="1497"/>
+          </w:tcPr>
+          <w:p>
+            <w:pPr>
+              <w:pStyle w:val="Compact"/>
+              <w:jc w:val="left"/>
+            </w:pPr>
+            <w:r>
+              <w:rPr>
+                <w:sz w:val="21"/>
+              </w:rPr>
               <w:t xml:space="preserve">19/07/2026</w:t>
             </w:r>
           </w:p>
         </w:tc>
         <w:tc>
-          <w:tcPr/>
-          <w:p>
-            <w:pPr>
-              <w:pStyle w:val="Compact"/>
-            </w:pPr>
-            <w:hyperlink r:id="rId10">
+          <w:tcPr>
+            <w:tcW w:type="dxa" w:w="1996"/>
+          </w:tcPr>
+          <w:p>
+            <w:pPr>
+              <w:pStyle w:val="Compact"/>
+              <w:jc w:val="left"/>
+            </w:pPr>
+            <w:hyperlink r:id="rId16">
               <w:r>
                 <w:rPr>
                   <w:rStyle w:val="VerbatimChar"/>
@@ -528,12 +714,15 @@
           </w:p>
         </w:tc>
         <w:tc>
-          <w:tcPr/>
-          <w:p>
-            <w:pPr>
-              <w:pStyle w:val="Compact"/>
-            </w:pPr>
-            <w:hyperlink r:id="rId11">
+          <w:tcPr>
+            <w:tcW w:type="dxa" w:w="1996"/>
+          </w:tcPr>
+          <w:p>
+            <w:pPr>
+              <w:pStyle w:val="Compact"/>
+              <w:jc w:val="left"/>
+            </w:pPr>
+            <w:hyperlink r:id="rId17">
               <w:r>
                 <w:rPr>
                   <w:rStyle w:val="VerbatimChar"/>
@@ -542,12 +731,18 @@
               </w:r>
             </w:hyperlink>
             <w:r>
+              <w:rPr>
+                <w:sz w:val="21"/>
+              </w:rPr>
               <w:t xml:space="preserve">,</w:t>
             </w:r>
             <w:r>
-              <w:t xml:space="preserve"> </w:t>
-            </w:r>
-            <w:hyperlink r:id="rId20">
+              <w:rPr>
+                <w:sz w:val="21"/>
+              </w:rPr>
+              <w:t xml:space="preserve"> </w:t>
+            </w:r>
+            <w:hyperlink r:id="rId25">
               <w:r>
                 <w:rPr>
                   <w:rStyle w:val="VerbatimChar"/>
@@ -558,12 +753,15 @@
           </w:p>
         </w:tc>
         <w:tc>
-          <w:tcPr/>
-          <w:p>
-            <w:pPr>
-              <w:pStyle w:val="Compact"/>
-            </w:pPr>
-            <w:hyperlink r:id="rId12">
+          <w:tcPr>
+            <w:tcW w:type="dxa" w:w="1996"/>
+          </w:tcPr>
+          <w:p>
+            <w:pPr>
+              <w:pStyle w:val="Compact"/>
+              <w:jc w:val="left"/>
+            </w:pPr>
+            <w:hyperlink r:id="rId18">
               <w:r>
                 <w:rPr>
                   <w:rStyle w:val="VerbatimChar"/>
@@ -572,15 +770,24 @@
               </w:r>
             </w:hyperlink>
             <w:r>
-              <w:t xml:space="preserve"> </w:t>
-            </w:r>
-            <w:r>
+              <w:rPr>
+                <w:sz w:val="21"/>
+              </w:rPr>
+              <w:t xml:space="preserve"> </w:t>
+            </w:r>
+            <w:r>
+              <w:rPr>
+                <w:sz w:val="21"/>
+              </w:rPr>
               <w:t xml:space="preserve">§2,</w:t>
             </w:r>
             <w:r>
-              <w:t xml:space="preserve"> </w:t>
-            </w:r>
-            <w:hyperlink r:id="rId21">
+              <w:rPr>
+                <w:sz w:val="21"/>
+              </w:rPr>
+              <w:t xml:space="preserve"> </w:t>
+            </w:r>
+            <w:hyperlink r:id="rId26">
               <w:r>
                 <w:rPr>
                   <w:rStyle w:val="VerbatimChar"/>
@@ -589,15 +796,24 @@
               </w:r>
             </w:hyperlink>
             <w:r>
-              <w:t xml:space="preserve"> </w:t>
-            </w:r>
-            <w:r>
+              <w:rPr>
+                <w:sz w:val="21"/>
+              </w:rPr>
+              <w:t xml:space="preserve"> </w:t>
+            </w:r>
+            <w:r>
+              <w:rPr>
+                <w:sz w:val="21"/>
+              </w:rPr>
               <w:t xml:space="preserve">§2,</w:t>
             </w:r>
             <w:r>
-              <w:t xml:space="preserve"> </w:t>
-            </w:r>
-            <w:hyperlink r:id="rId22">
+              <w:rPr>
+                <w:sz w:val="21"/>
+              </w:rPr>
+              <w:t xml:space="preserve"> </w:t>
+            </w:r>
+            <w:hyperlink r:id="rId27">
               <w:r>
                 <w:rPr>
                   <w:rStyle w:val="VerbatimChar"/>
@@ -610,34 +826,49 @@
       </w:tr>
       <w:tr>
         <w:tc>
-          <w:tcPr/>
-          <w:p>
-            <w:pPr>
-              <w:pStyle w:val="Compact"/>
-            </w:pPr>
-            <w:r>
+          <w:tcPr>
+            <w:tcW w:type="dxa" w:w="1875"/>
+          </w:tcPr>
+          <w:p>
+            <w:pPr>
+              <w:pStyle w:val="Compact"/>
+              <w:jc w:val="left"/>
+            </w:pPr>
+            <w:r>
+              <w:rPr>
+                <w:sz w:val="21"/>
+              </w:rPr>
               <w:t xml:space="preserve">Design and parsers</w:t>
             </w:r>
           </w:p>
         </w:tc>
         <w:tc>
-          <w:tcPr/>
-          <w:p>
-            <w:pPr>
-              <w:pStyle w:val="Compact"/>
-            </w:pPr>
-            <w:r>
+          <w:tcPr>
+            <w:tcW w:type="dxa" w:w="1497"/>
+          </w:tcPr>
+          <w:p>
+            <w:pPr>
+              <w:pStyle w:val="Compact"/>
+              <w:jc w:val="left"/>
+            </w:pPr>
+            <w:r>
+              <w:rPr>
+                <w:sz w:val="21"/>
+              </w:rPr>
               <w:t xml:space="preserve">29/07/2026</w:t>
             </w:r>
           </w:p>
         </w:tc>
         <w:tc>
-          <w:tcPr/>
-          <w:p>
-            <w:pPr>
-              <w:pStyle w:val="Compact"/>
-            </w:pPr>
-            <w:hyperlink r:id="rId13">
+          <w:tcPr>
+            <w:tcW w:type="dxa" w:w="1996"/>
+          </w:tcPr>
+          <w:p>
+            <w:pPr>
+              <w:pStyle w:val="Compact"/>
+              <w:jc w:val="left"/>
+            </w:pPr>
+            <w:hyperlink r:id="rId19">
               <w:r>
                 <w:rPr>
                   <w:rStyle w:val="VerbatimChar"/>
@@ -648,12 +879,15 @@
           </w:p>
         </w:tc>
         <w:tc>
-          <w:tcPr/>
-          <w:p>
-            <w:pPr>
-              <w:pStyle w:val="Compact"/>
-            </w:pPr>
-            <w:hyperlink r:id="rId14">
+          <w:tcPr>
+            <w:tcW w:type="dxa" w:w="1996"/>
+          </w:tcPr>
+          <w:p>
+            <w:pPr>
+              <w:pStyle w:val="Compact"/>
+              <w:jc w:val="left"/>
+            </w:pPr>
+            <w:hyperlink r:id="rId20">
               <w:r>
                 <w:rPr>
                   <w:rStyle w:val="VerbatimChar"/>
@@ -662,12 +896,18 @@
               </w:r>
             </w:hyperlink>
             <w:r>
+              <w:rPr>
+                <w:sz w:val="21"/>
+              </w:rPr>
               <w:t xml:space="preserve">,</w:t>
             </w:r>
             <w:r>
-              <w:t xml:space="preserve"> </w:t>
-            </w:r>
-            <w:hyperlink r:id="rId23">
+              <w:rPr>
+                <w:sz w:val="21"/>
+              </w:rPr>
+              <w:t xml:space="preserve"> </w:t>
+            </w:r>
+            <w:hyperlink r:id="rId28">
               <w:r>
                 <w:rPr>
                   <w:rStyle w:val="VerbatimChar"/>
@@ -676,12 +916,18 @@
               </w:r>
             </w:hyperlink>
             <w:r>
+              <w:rPr>
+                <w:sz w:val="21"/>
+              </w:rPr>
               <w:t xml:space="preserve">,</w:t>
             </w:r>
             <w:r>
-              <w:t xml:space="preserve"> </w:t>
-            </w:r>
-            <w:hyperlink r:id="rId16">
+              <w:rPr>
+                <w:sz w:val="21"/>
+              </w:rPr>
+              <w:t xml:space="preserve"> </w:t>
+            </w:r>
+            <w:hyperlink r:id="rId22">
               <w:r>
                 <w:rPr>
                   <w:rStyle w:val="VerbatimChar"/>
@@ -690,12 +936,18 @@
               </w:r>
             </w:hyperlink>
             <w:r>
+              <w:rPr>
+                <w:sz w:val="21"/>
+              </w:rPr>
               <w:t xml:space="preserve">,</w:t>
             </w:r>
             <w:r>
-              <w:t xml:space="preserve"> </w:t>
-            </w:r>
-            <w:hyperlink r:id="rId24">
+              <w:rPr>
+                <w:sz w:val="21"/>
+              </w:rPr>
+              <w:t xml:space="preserve"> </w:t>
+            </w:r>
+            <w:hyperlink r:id="rId29">
               <w:r>
                 <w:rPr>
                   <w:rStyle w:val="VerbatimChar"/>
@@ -706,12 +958,15 @@
           </w:p>
         </w:tc>
         <w:tc>
-          <w:tcPr/>
-          <w:p>
-            <w:pPr>
-              <w:pStyle w:val="Compact"/>
-            </w:pPr>
-            <w:hyperlink r:id="rId25">
+          <w:tcPr>
+            <w:tcW w:type="dxa" w:w="1996"/>
+          </w:tcPr>
+          <w:p>
+            <w:pPr>
+              <w:pStyle w:val="Compact"/>
+              <w:jc w:val="left"/>
+            </w:pPr>
+            <w:hyperlink r:id="rId30">
               <w:r>
                 <w:rPr>
                   <w:rStyle w:val="VerbatimChar"/>
@@ -720,12 +975,18 @@
               </w:r>
             </w:hyperlink>
             <w:r>
+              <w:rPr>
+                <w:sz w:val="21"/>
+              </w:rPr>
               <w:t xml:space="preserve">,</w:t>
             </w:r>
             <w:r>
-              <w:t xml:space="preserve"> </w:t>
-            </w:r>
-            <w:hyperlink r:id="rId26">
+              <w:rPr>
+                <w:sz w:val="21"/>
+              </w:rPr>
+              <w:t xml:space="preserve"> </w:t>
+            </w:r>
+            <w:hyperlink r:id="rId31">
               <w:r>
                 <w:rPr>
                   <w:rStyle w:val="VerbatimChar"/>
@@ -734,12 +995,18 @@
               </w:r>
             </w:hyperlink>
             <w:r>
+              <w:rPr>
+                <w:sz w:val="21"/>
+              </w:rPr>
               <w:t xml:space="preserve">,</w:t>
             </w:r>
             <w:r>
-              <w:t xml:space="preserve"> </w:t>
-            </w:r>
-            <w:hyperlink r:id="rId27">
+              <w:rPr>
+                <w:sz w:val="21"/>
+              </w:rPr>
+              <w:t xml:space="preserve"> </w:t>
+            </w:r>
+            <w:hyperlink r:id="rId32">
               <w:r>
                 <w:rPr>
                   <w:rStyle w:val="VerbatimChar"/>
@@ -752,34 +1019,49 @@
       </w:tr>
       <w:tr>
         <w:tc>
-          <w:tcPr/>
-          <w:p>
-            <w:pPr>
-              <w:pStyle w:val="Compact"/>
-            </w:pPr>
-            <w:r>
+          <w:tcPr>
+            <w:tcW w:type="dxa" w:w="1875"/>
+          </w:tcPr>
+          <w:p>
+            <w:pPr>
+              <w:pStyle w:val="Compact"/>
+              <w:jc w:val="left"/>
+            </w:pPr>
+            <w:r>
+              <w:rPr>
+                <w:sz w:val="21"/>
+              </w:rPr>
               <w:t xml:space="preserve">Feature extraction and anomaly detection</w:t>
             </w:r>
           </w:p>
         </w:tc>
         <w:tc>
-          <w:tcPr/>
-          <w:p>
-            <w:pPr>
-              <w:pStyle w:val="Compact"/>
-            </w:pPr>
-            <w:r>
+          <w:tcPr>
+            <w:tcW w:type="dxa" w:w="1497"/>
+          </w:tcPr>
+          <w:p>
+            <w:pPr>
+              <w:pStyle w:val="Compact"/>
+              <w:jc w:val="left"/>
+            </w:pPr>
+            <w:r>
+              <w:rPr>
+                <w:sz w:val="21"/>
+              </w:rPr>
               <w:t xml:space="preserve">17/08/2026</w:t>
             </w:r>
           </w:p>
         </w:tc>
         <w:tc>
-          <w:tcPr/>
-          <w:p>
-            <w:pPr>
-              <w:pStyle w:val="Compact"/>
-            </w:pPr>
-            <w:hyperlink r:id="rId28">
+          <w:tcPr>
+            <w:tcW w:type="dxa" w:w="1996"/>
+          </w:tcPr>
+          <w:p>
+            <w:pPr>
+              <w:pStyle w:val="Compact"/>
+              <w:jc w:val="left"/>
+            </w:pPr>
+            <w:hyperlink r:id="rId33">
               <w:r>
                 <w:rPr>
                   <w:rStyle w:val="VerbatimChar"/>
@@ -790,12 +1072,15 @@
           </w:p>
         </w:tc>
         <w:tc>
-          <w:tcPr/>
-          <w:p>
-            <w:pPr>
-              <w:pStyle w:val="Compact"/>
-            </w:pPr>
-            <w:hyperlink r:id="rId15">
+          <w:tcPr>
+            <w:tcW w:type="dxa" w:w="1996"/>
+          </w:tcPr>
+          <w:p>
+            <w:pPr>
+              <w:pStyle w:val="Compact"/>
+              <w:jc w:val="left"/>
+            </w:pPr>
+            <w:hyperlink r:id="rId21">
               <w:r>
                 <w:rPr>
                   <w:rStyle w:val="VerbatimChar"/>
@@ -804,12 +1089,18 @@
               </w:r>
             </w:hyperlink>
             <w:r>
+              <w:rPr>
+                <w:sz w:val="21"/>
+              </w:rPr>
               <w:t xml:space="preserve">,</w:t>
             </w:r>
             <w:r>
-              <w:t xml:space="preserve"> </w:t>
-            </w:r>
-            <w:hyperlink r:id="rId29">
+              <w:rPr>
+                <w:sz w:val="21"/>
+              </w:rPr>
+              <w:t xml:space="preserve"> </w:t>
+            </w:r>
+            <w:hyperlink r:id="rId34">
               <w:r>
                 <w:rPr>
                   <w:rStyle w:val="VerbatimChar"/>
@@ -818,12 +1109,18 @@
               </w:r>
             </w:hyperlink>
             <w:r>
+              <w:rPr>
+                <w:sz w:val="21"/>
+              </w:rPr>
               <w:t xml:space="preserve">,</w:t>
             </w:r>
             <w:r>
-              <w:t xml:space="preserve"> </w:t>
-            </w:r>
-            <w:hyperlink r:id="rId30">
+              <w:rPr>
+                <w:sz w:val="21"/>
+              </w:rPr>
+              <w:t xml:space="preserve"> </w:t>
+            </w:r>
+            <w:hyperlink r:id="rId35">
               <w:r>
                 <w:rPr>
                   <w:rStyle w:val="VerbatimChar"/>
@@ -832,12 +1129,18 @@
               </w:r>
             </w:hyperlink>
             <w:r>
+              <w:rPr>
+                <w:sz w:val="21"/>
+              </w:rPr>
               <w:t xml:space="preserve">,</w:t>
             </w:r>
             <w:r>
-              <w:t xml:space="preserve"> </w:t>
-            </w:r>
-            <w:hyperlink r:id="rId31">
+              <w:rPr>
+                <w:sz w:val="21"/>
+              </w:rPr>
+              <w:t xml:space="preserve"> </w:t>
+            </w:r>
+            <w:hyperlink r:id="rId36">
               <w:r>
                 <w:rPr>
                   <w:rStyle w:val="VerbatimChar"/>
@@ -848,12 +1151,15 @@
           </w:p>
         </w:tc>
         <w:tc>
-          <w:tcPr/>
-          <w:p>
-            <w:pPr>
-              <w:pStyle w:val="Compact"/>
-            </w:pPr>
-            <w:hyperlink r:id="rId32">
+          <w:tcPr>
+            <w:tcW w:type="dxa" w:w="1996"/>
+          </w:tcPr>
+          <w:p>
+            <w:pPr>
+              <w:pStyle w:val="Compact"/>
+              <w:jc w:val="left"/>
+            </w:pPr>
+            <w:hyperlink r:id="rId37">
               <w:r>
                 <w:rPr>
                   <w:rStyle w:val="VerbatimChar"/>
@@ -862,12 +1168,18 @@
               </w:r>
             </w:hyperlink>
             <w:r>
+              <w:rPr>
+                <w:sz w:val="21"/>
+              </w:rPr>
               <w:t xml:space="preserve">,</w:t>
             </w:r>
             <w:r>
-              <w:t xml:space="preserve"> </w:t>
-            </w:r>
-            <w:hyperlink r:id="rId33">
+              <w:rPr>
+                <w:sz w:val="21"/>
+              </w:rPr>
+              <w:t xml:space="preserve"> </w:t>
+            </w:r>
+            <w:hyperlink r:id="rId38">
               <w:r>
                 <w:rPr>
                   <w:rStyle w:val="VerbatimChar"/>
@@ -880,34 +1192,49 @@
       </w:tr>
       <w:tr>
         <w:tc>
-          <w:tcPr/>
-          <w:p>
-            <w:pPr>
-              <w:pStyle w:val="Compact"/>
-            </w:pPr>
-            <w:r>
+          <w:tcPr>
+            <w:tcW w:type="dxa" w:w="1875"/>
+          </w:tcPr>
+          <w:p>
+            <w:pPr>
+              <w:pStyle w:val="Compact"/>
+              <w:jc w:val="left"/>
+            </w:pPr>
+            <w:r>
+              <w:rPr>
+                <w:sz w:val="21"/>
+              </w:rPr>
               <w:t xml:space="preserve">Validation and documentation</w:t>
             </w:r>
           </w:p>
         </w:tc>
         <w:tc>
-          <w:tcPr/>
-          <w:p>
-            <w:pPr>
-              <w:pStyle w:val="Compact"/>
-            </w:pPr>
-            <w:r>
+          <w:tcPr>
+            <w:tcW w:type="dxa" w:w="1497"/>
+          </w:tcPr>
+          <w:p>
+            <w:pPr>
+              <w:pStyle w:val="Compact"/>
+              <w:jc w:val="left"/>
+            </w:pPr>
+            <w:r>
+              <w:rPr>
+                <w:sz w:val="21"/>
+              </w:rPr>
               <w:t xml:space="preserve">07/09/2026</w:t>
             </w:r>
           </w:p>
         </w:tc>
         <w:tc>
-          <w:tcPr/>
-          <w:p>
-            <w:pPr>
-              <w:pStyle w:val="Compact"/>
-            </w:pPr>
-            <w:hyperlink r:id="rId34">
+          <w:tcPr>
+            <w:tcW w:type="dxa" w:w="1996"/>
+          </w:tcPr>
+          <w:p>
+            <w:pPr>
+              <w:pStyle w:val="Compact"/>
+              <w:jc w:val="left"/>
+            </w:pPr>
+            <w:hyperlink r:id="rId39">
               <w:r>
                 <w:rPr>
                   <w:rStyle w:val="VerbatimChar"/>
@@ -918,12 +1245,15 @@
           </w:p>
         </w:tc>
         <w:tc>
-          <w:tcPr/>
-          <w:p>
-            <w:pPr>
-              <w:pStyle w:val="Compact"/>
-            </w:pPr>
-            <w:hyperlink r:id="rId35">
+          <w:tcPr>
+            <w:tcW w:type="dxa" w:w="1996"/>
+          </w:tcPr>
+          <w:p>
+            <w:pPr>
+              <w:pStyle w:val="Compact"/>
+              <w:jc w:val="left"/>
+            </w:pPr>
+            <w:hyperlink r:id="rId40">
               <w:r>
                 <w:rPr>
                   <w:rStyle w:val="VerbatimChar"/>
@@ -932,12 +1262,18 @@
               </w:r>
             </w:hyperlink>
             <w:r>
+              <w:rPr>
+                <w:sz w:val="21"/>
+              </w:rPr>
               <w:t xml:space="preserve">,</w:t>
             </w:r>
             <w:r>
-              <w:t xml:space="preserve"> </w:t>
-            </w:r>
-            <w:hyperlink r:id="rId36">
+              <w:rPr>
+                <w:sz w:val="21"/>
+              </w:rPr>
+              <w:t xml:space="preserve"> </w:t>
+            </w:r>
+            <w:hyperlink r:id="rId41">
               <w:r>
                 <w:rPr>
                   <w:rStyle w:val="VerbatimChar"/>
@@ -946,12 +1282,18 @@
               </w:r>
             </w:hyperlink>
             <w:r>
+              <w:rPr>
+                <w:sz w:val="21"/>
+              </w:rPr>
               <w:t xml:space="preserve">,</w:t>
             </w:r>
             <w:r>
-              <w:t xml:space="preserve"> </w:t>
-            </w:r>
-            <w:hyperlink r:id="rId37">
+              <w:rPr>
+                <w:sz w:val="21"/>
+              </w:rPr>
+              <w:t xml:space="preserve"> </w:t>
+            </w:r>
+            <w:hyperlink r:id="rId42">
               <w:r>
                 <w:rPr>
                   <w:rStyle w:val="VerbatimChar"/>
@@ -960,12 +1302,18 @@
               </w:r>
             </w:hyperlink>
             <w:r>
+              <w:rPr>
+                <w:sz w:val="21"/>
+              </w:rPr>
               <w:t xml:space="preserve">,</w:t>
             </w:r>
             <w:r>
-              <w:t xml:space="preserve"> </w:t>
-            </w:r>
-            <w:hyperlink r:id="rId38">
+              <w:rPr>
+                <w:sz w:val="21"/>
+              </w:rPr>
+              <w:t xml:space="preserve"> </w:t>
+            </w:r>
+            <w:hyperlink r:id="rId43">
               <w:r>
                 <w:rPr>
                   <w:rStyle w:val="VerbatimChar"/>
@@ -976,12 +1324,15 @@
           </w:p>
         </w:tc>
         <w:tc>
-          <w:tcPr/>
-          <w:p>
-            <w:pPr>
-              <w:pStyle w:val="Compact"/>
-            </w:pPr>
-            <w:hyperlink r:id="rId39">
+          <w:tcPr>
+            <w:tcW w:type="dxa" w:w="1996"/>
+          </w:tcPr>
+          <w:p>
+            <w:pPr>
+              <w:pStyle w:val="Compact"/>
+              <w:jc w:val="left"/>
+            </w:pPr>
+            <w:hyperlink r:id="rId44">
               <w:r>
                 <w:rPr>
                   <w:rStyle w:val="VerbatimChar"/>
@@ -990,12 +1341,18 @@
               </w:r>
             </w:hyperlink>
             <w:r>
+              <w:rPr>
+                <w:sz w:val="21"/>
+              </w:rPr>
               <w:t xml:space="preserve">,</w:t>
             </w:r>
             <w:r>
-              <w:t xml:space="preserve"> </w:t>
-            </w:r>
-            <w:hyperlink r:id="rId40">
+              <w:rPr>
+                <w:sz w:val="21"/>
+              </w:rPr>
+              <w:t xml:space="preserve"> </w:t>
+            </w:r>
+            <w:hyperlink r:id="rId45">
               <w:r>
                 <w:rPr>
                   <w:rStyle w:val="VerbatimChar"/>
@@ -1004,12 +1361,18 @@
               </w:r>
             </w:hyperlink>
             <w:r>
+              <w:rPr>
+                <w:sz w:val="21"/>
+              </w:rPr>
               <w:t xml:space="preserve">,</w:t>
             </w:r>
             <w:r>
-              <w:t xml:space="preserve"> </w:t>
-            </w:r>
-            <w:hyperlink r:id="rId41">
+              <w:rPr>
+                <w:sz w:val="21"/>
+              </w:rPr>
+              <w:t xml:space="preserve"> </w:t>
+            </w:r>
+            <w:hyperlink r:id="rId12">
               <w:r>
                 <w:rPr>
                   <w:rStyle w:val="VerbatimChar"/>
@@ -1022,34 +1385,49 @@
       </w:tr>
       <w:tr>
         <w:tc>
-          <w:tcPr/>
-          <w:p>
-            <w:pPr>
-              <w:pStyle w:val="Compact"/>
-            </w:pPr>
-            <w:r>
+          <w:tcPr>
+            <w:tcW w:type="dxa" w:w="1875"/>
+          </w:tcPr>
+          <w:p>
+            <w:pPr>
+              <w:pStyle w:val="Compact"/>
+              <w:jc w:val="left"/>
+            </w:pPr>
+            <w:r>
+              <w:rPr>
+                <w:sz w:val="21"/>
+              </w:rPr>
               <w:t xml:space="preserve">Full report draft (ready for system submission)</w:t>
             </w:r>
           </w:p>
         </w:tc>
         <w:tc>
-          <w:tcPr/>
-          <w:p>
-            <w:pPr>
-              <w:pStyle w:val="Compact"/>
-            </w:pPr>
-            <w:r>
+          <w:tcPr>
+            <w:tcW w:type="dxa" w:w="1497"/>
+          </w:tcPr>
+          <w:p>
+            <w:pPr>
+              <w:pStyle w:val="Compact"/>
+              <w:jc w:val="left"/>
+            </w:pPr>
+            <w:r>
+              <w:rPr>
+                <w:sz w:val="21"/>
+              </w:rPr>
               <w:t xml:space="preserve">15/09/2026</w:t>
             </w:r>
           </w:p>
         </w:tc>
         <w:tc>
-          <w:tcPr/>
-          <w:p>
-            <w:pPr>
-              <w:pStyle w:val="Compact"/>
-            </w:pPr>
-            <w:hyperlink r:id="rId42">
+          <w:tcPr>
+            <w:tcW w:type="dxa" w:w="1996"/>
+          </w:tcPr>
+          <w:p>
+            <w:pPr>
+              <w:pStyle w:val="Compact"/>
+              <w:jc w:val="left"/>
+            </w:pPr>
+            <w:hyperlink r:id="rId46">
               <w:r>
                 <w:rPr>
                   <w:rStyle w:val="VerbatimChar"/>
@@ -1060,12 +1438,15 @@
           </w:p>
         </w:tc>
         <w:tc>
-          <w:tcPr/>
-          <w:p>
-            <w:pPr>
-              <w:pStyle w:val="Compact"/>
-            </w:pPr>
-            <w:hyperlink r:id="rId43">
+          <w:tcPr>
+            <w:tcW w:type="dxa" w:w="1996"/>
+          </w:tcPr>
+          <w:p>
+            <w:pPr>
+              <w:pStyle w:val="Compact"/>
+              <w:jc w:val="left"/>
+            </w:pPr>
+            <w:hyperlink r:id="rId47">
               <w:r>
                 <w:rPr>
                   <w:rStyle w:val="VerbatimChar"/>
@@ -1074,12 +1455,18 @@
               </w:r>
             </w:hyperlink>
             <w:r>
+              <w:rPr>
+                <w:sz w:val="21"/>
+              </w:rPr>
               <w:t xml:space="preserve">,</w:t>
             </w:r>
             <w:r>
-              <w:t xml:space="preserve"> </w:t>
-            </w:r>
-            <w:hyperlink r:id="rId44">
+              <w:rPr>
+                <w:sz w:val="21"/>
+              </w:rPr>
+              <w:t xml:space="preserve"> </w:t>
+            </w:r>
+            <w:hyperlink r:id="rId48">
               <w:r>
                 <w:rPr>
                   <w:rStyle w:val="VerbatimChar"/>
@@ -1088,12 +1475,18 @@
               </w:r>
             </w:hyperlink>
             <w:r>
+              <w:rPr>
+                <w:sz w:val="21"/>
+              </w:rPr>
               <w:t xml:space="preserve">,</w:t>
             </w:r>
             <w:r>
-              <w:t xml:space="preserve"> </w:t>
-            </w:r>
-            <w:hyperlink r:id="rId45">
+              <w:rPr>
+                <w:sz w:val="21"/>
+              </w:rPr>
+              <w:t xml:space="preserve"> </w:t>
+            </w:r>
+            <w:hyperlink r:id="rId49">
               <w:r>
                 <w:rPr>
                   <w:rStyle w:val="VerbatimChar"/>
@@ -1102,12 +1495,18 @@
               </w:r>
             </w:hyperlink>
             <w:r>
+              <w:rPr>
+                <w:sz w:val="21"/>
+              </w:rPr>
               <w:t xml:space="preserve">,</w:t>
             </w:r>
             <w:r>
-              <w:t xml:space="preserve"> </w:t>
-            </w:r>
-            <w:hyperlink r:id="rId46">
+              <w:rPr>
+                <w:sz w:val="21"/>
+              </w:rPr>
+              <w:t xml:space="preserve"> </w:t>
+            </w:r>
+            <w:hyperlink r:id="rId50">
               <w:r>
                 <w:rPr>
                   <w:rStyle w:val="VerbatimChar"/>
@@ -1118,12 +1517,15 @@
           </w:p>
         </w:tc>
         <w:tc>
-          <w:tcPr/>
-          <w:p>
-            <w:pPr>
-              <w:pStyle w:val="Compact"/>
-            </w:pPr>
-            <w:hyperlink r:id="rId21">
+          <w:tcPr>
+            <w:tcW w:type="dxa" w:w="1996"/>
+          </w:tcPr>
+          <w:p>
+            <w:pPr>
+              <w:pStyle w:val="Compact"/>
+              <w:jc w:val="left"/>
+            </w:pPr>
+            <w:hyperlink r:id="rId26">
               <w:r>
                 <w:rPr>
                   <w:rStyle w:val="VerbatimChar"/>
@@ -1132,12 +1534,18 @@
               </w:r>
             </w:hyperlink>
             <w:r>
+              <w:rPr>
+                <w:sz w:val="21"/>
+              </w:rPr>
               <w:t xml:space="preserve">,</w:t>
             </w:r>
             <w:r>
-              <w:t xml:space="preserve"> </w:t>
-            </w:r>
-            <w:hyperlink r:id="rId47">
+              <w:rPr>
+                <w:sz w:val="21"/>
+              </w:rPr>
+              <w:t xml:space="preserve"> </w:t>
+            </w:r>
+            <w:hyperlink r:id="rId51">
               <w:r>
                 <w:rPr>
                   <w:rStyle w:val="VerbatimChar"/>
@@ -1150,50 +1558,68 @@
       </w:tr>
       <w:tr>
         <w:tc>
-          <w:tcPr/>
-          <w:p>
-            <w:pPr>
-              <w:pStyle w:val="Compact"/>
-            </w:pPr>
-            <w:r>
+          <w:tcPr>
+            <w:tcW w:type="dxa" w:w="1875"/>
+          </w:tcPr>
+          <w:p>
+            <w:pPr>
+              <w:pStyle w:val="Compact"/>
+              <w:jc w:val="left"/>
+            </w:pPr>
+            <w:r>
+              <w:rPr>
+                <w:sz w:val="21"/>
+              </w:rPr>
               <w:t xml:space="preserve">Final report and submission</w:t>
             </w:r>
           </w:p>
         </w:tc>
         <w:tc>
-          <w:tcPr/>
-          <w:p>
-            <w:pPr>
-              <w:pStyle w:val="Compact"/>
-            </w:pPr>
-            <w:r>
-              <w:t xml:space="preserve">29/09/2026</w:t>
-            </w:r>
-          </w:p>
-        </w:tc>
-        <w:tc>
-          <w:tcPr/>
-          <w:p>
-            <w:pPr>
-              <w:pStyle w:val="Compact"/>
-            </w:pPr>
-            <w:hyperlink r:id="rId42">
-              <w:r>
-                <w:rPr>
-                  <w:rStyle w:val="VerbatimChar"/>
-                </w:rPr>
-                <w:t xml:space="preserve">v-submission-package</w:t>
-              </w:r>
-            </w:hyperlink>
-          </w:p>
-        </w:tc>
-        <w:tc>
-          <w:tcPr/>
-          <w:p>
-            <w:pPr>
-              <w:pStyle w:val="Compact"/>
-            </w:pPr>
-            <w:hyperlink r:id="rId43">
+          <w:tcPr>
+            <w:tcW w:type="dxa" w:w="1497"/>
+          </w:tcPr>
+          <w:p>
+            <w:pPr>
+              <w:pStyle w:val="Compact"/>
+              <w:jc w:val="left"/>
+            </w:pPr>
+            <w:r>
+              <w:rPr>
+                <w:sz w:val="21"/>
+              </w:rPr>
+              <w:t xml:space="preserve">23/09/2026</w:t>
+            </w:r>
+          </w:p>
+        </w:tc>
+        <w:tc>
+          <w:tcPr>
+            <w:tcW w:type="dxa" w:w="1996"/>
+          </w:tcPr>
+          <w:p>
+            <w:pPr>
+              <w:pStyle w:val="Compact"/>
+              <w:jc w:val="left"/>
+            </w:pPr>
+            <w:hyperlink r:id="rId46">
+              <w:r>
+                <w:rPr>
+                  <w:rStyle w:val="VerbatimChar"/>
+                </w:rPr>
+                <w:t xml:space="preserve">v-resubmission</w:t>
+              </w:r>
+            </w:hyperlink>
+          </w:p>
+        </w:tc>
+        <w:tc>
+          <w:tcPr>
+            <w:tcW w:type="dxa" w:w="1996"/>
+          </w:tcPr>
+          <w:p>
+            <w:pPr>
+              <w:pStyle w:val="Compact"/>
+              <w:jc w:val="left"/>
+            </w:pPr>
+            <w:hyperlink r:id="rId47">
               <w:r>
                 <w:rPr>
                   <w:rStyle w:val="VerbatimChar"/>
@@ -1202,12 +1628,18 @@
               </w:r>
             </w:hyperlink>
             <w:r>
+              <w:rPr>
+                <w:sz w:val="21"/>
+              </w:rPr>
               <w:t xml:space="preserve">,</w:t>
             </w:r>
             <w:r>
-              <w:t xml:space="preserve"> </w:t>
-            </w:r>
-            <w:hyperlink r:id="rId44">
+              <w:rPr>
+                <w:sz w:val="21"/>
+              </w:rPr>
+              <w:t xml:space="preserve"> </w:t>
+            </w:r>
+            <w:hyperlink r:id="rId48">
               <w:r>
                 <w:rPr>
                   <w:rStyle w:val="VerbatimChar"/>
@@ -1216,12 +1648,18 @@
               </w:r>
             </w:hyperlink>
             <w:r>
+              <w:rPr>
+                <w:sz w:val="21"/>
+              </w:rPr>
               <w:t xml:space="preserve">,</w:t>
             </w:r>
             <w:r>
-              <w:t xml:space="preserve"> </w:t>
-            </w:r>
-            <w:hyperlink r:id="rId48">
+              <w:rPr>
+                <w:sz w:val="21"/>
+              </w:rPr>
+              <w:t xml:space="preserve"> </w:t>
+            </w:r>
+            <w:hyperlink r:id="rId52">
               <w:r>
                 <w:rPr>
                   <w:rStyle w:val="VerbatimChar"/>
@@ -1230,12 +1668,18 @@
               </w:r>
             </w:hyperlink>
             <w:r>
+              <w:rPr>
+                <w:sz w:val="21"/>
+              </w:rPr>
               <w:t xml:space="preserve">,</w:t>
             </w:r>
             <w:r>
-              <w:t xml:space="preserve"> </w:t>
-            </w:r>
-            <w:hyperlink r:id="rId49">
+              <w:rPr>
+                <w:sz w:val="21"/>
+              </w:rPr>
+              <w:t xml:space="preserve"> </w:t>
+            </w:r>
+            <w:hyperlink r:id="rId53">
               <w:r>
                 <w:rPr>
                   <w:rStyle w:val="VerbatimChar"/>
@@ -1246,12 +1690,15 @@
           </w:p>
         </w:tc>
         <w:tc>
-          <w:tcPr/>
-          <w:p>
-            <w:pPr>
-              <w:pStyle w:val="Compact"/>
-            </w:pPr>
-            <w:hyperlink r:id="rId21">
+          <w:tcPr>
+            <w:tcW w:type="dxa" w:w="1996"/>
+          </w:tcPr>
+          <w:p>
+            <w:pPr>
+              <w:pStyle w:val="Compact"/>
+              <w:jc w:val="left"/>
+            </w:pPr>
+            <w:hyperlink r:id="rId26">
               <w:r>
                 <w:rPr>
                   <w:rStyle w:val="VerbatimChar"/>
@@ -1260,12 +1707,18 @@
               </w:r>
             </w:hyperlink>
             <w:r>
+              <w:rPr>
+                <w:sz w:val="21"/>
+              </w:rPr>
               <w:t xml:space="preserve">,</w:t>
             </w:r>
             <w:r>
-              <w:t xml:space="preserve"> </w:t>
-            </w:r>
-            <w:hyperlink r:id="rId50">
+              <w:rPr>
+                <w:sz w:val="21"/>
+              </w:rPr>
+              <w:t xml:space="preserve"> </w:t>
+            </w:r>
+            <w:hyperlink r:id="rId13">
               <w:r>
                 <w:rPr>
                   <w:rStyle w:val="VerbatimChar"/>
@@ -1278,34 +1731,49 @@
       </w:tr>
       <w:tr>
         <w:tc>
-          <w:tcPr/>
-          <w:p>
-            <w:pPr>
-              <w:pStyle w:val="Compact"/>
-            </w:pPr>
-            <w:r>
+          <w:tcPr>
+            <w:tcW w:type="dxa" w:w="1875"/>
+          </w:tcPr>
+          <w:p>
+            <w:pPr>
+              <w:pStyle w:val="Compact"/>
+              <w:jc w:val="left"/>
+            </w:pPr>
+            <w:r>
+              <w:rPr>
+                <w:sz w:val="21"/>
+              </w:rPr>
               <w:t xml:space="preserve">Final Submission</w:t>
             </w:r>
           </w:p>
         </w:tc>
         <w:tc>
-          <w:tcPr/>
-          <w:p>
-            <w:pPr>
-              <w:pStyle w:val="Compact"/>
-            </w:pPr>
-            <w:r>
+          <w:tcPr>
+            <w:tcW w:type="dxa" w:w="1497"/>
+          </w:tcPr>
+          <w:p>
+            <w:pPr>
+              <w:pStyle w:val="Compact"/>
+              <w:jc w:val="left"/>
+            </w:pPr>
+            <w:r>
+              <w:rPr>
+                <w:sz w:val="21"/>
+              </w:rPr>
               <w:t xml:space="preserve">29/09/2026</w:t>
             </w:r>
           </w:p>
         </w:tc>
         <w:tc>
-          <w:tcPr/>
-          <w:p>
-            <w:pPr>
-              <w:pStyle w:val="Compact"/>
-            </w:pPr>
-            <w:hyperlink r:id="rId42">
+          <w:tcPr>
+            <w:tcW w:type="dxa" w:w="1996"/>
+          </w:tcPr>
+          <w:p>
+            <w:pPr>
+              <w:pStyle w:val="Compact"/>
+              <w:jc w:val="left"/>
+            </w:pPr>
+            <w:hyperlink r:id="rId46">
               <w:r>
                 <w:rPr>
                   <w:rStyle w:val="VerbatimChar"/>
@@ -1316,12 +1784,15 @@
           </w:p>
         </w:tc>
         <w:tc>
-          <w:tcPr/>
-          <w:p>
-            <w:pPr>
-              <w:pStyle w:val="Compact"/>
-            </w:pPr>
-            <w:hyperlink r:id="rId44">
+          <w:tcPr>
+            <w:tcW w:type="dxa" w:w="1996"/>
+          </w:tcPr>
+          <w:p>
+            <w:pPr>
+              <w:pStyle w:val="Compact"/>
+              <w:jc w:val="left"/>
+            </w:pPr>
+            <w:hyperlink r:id="rId48">
               <w:r>
                 <w:rPr>
                   <w:rStyle w:val="VerbatimChar"/>
@@ -1330,12 +1801,18 @@
               </w:r>
             </w:hyperlink>
             <w:r>
+              <w:rPr>
+                <w:sz w:val="21"/>
+              </w:rPr>
               <w:t xml:space="preserve">,</w:t>
             </w:r>
             <w:r>
-              <w:t xml:space="preserve"> </w:t>
-            </w:r>
-            <w:hyperlink r:id="rId51">
+              <w:rPr>
+                <w:sz w:val="21"/>
+              </w:rPr>
+              <w:t xml:space="preserve"> </w:t>
+            </w:r>
+            <w:hyperlink r:id="rId54">
               <w:r>
                 <w:rPr>
                   <w:rStyle w:val="VerbatimChar"/>
@@ -1346,12 +1823,15 @@
           </w:p>
         </w:tc>
         <w:tc>
-          <w:tcPr/>
-          <w:p>
-            <w:pPr>
-              <w:pStyle w:val="Compact"/>
-            </w:pPr>
-            <w:hyperlink r:id="rId50">
+          <w:tcPr>
+            <w:tcW w:type="dxa" w:w="1996"/>
+          </w:tcPr>
+          <w:p>
+            <w:pPr>
+              <w:pStyle w:val="Compact"/>
+              <w:jc w:val="left"/>
+            </w:pPr>
+            <w:hyperlink r:id="rId13">
               <w:r>
                 <w:rPr>
                   <w:rStyle w:val="VerbatimChar"/>
@@ -1360,12 +1840,18 @@
               </w:r>
             </w:hyperlink>
             <w:r>
+              <w:rPr>
+                <w:sz w:val="21"/>
+              </w:rPr>
               <w:t xml:space="preserve">,</w:t>
             </w:r>
             <w:r>
-              <w:t xml:space="preserve"> </w:t>
-            </w:r>
-            <w:hyperlink r:id="rId52">
+              <w:rPr>
+                <w:sz w:val="21"/>
+              </w:rPr>
+              <w:t xml:space="preserve"> </w:t>
+            </w:r>
+            <w:hyperlink r:id="rId14">
               <w:r>
                 <w:rPr>
                   <w:rStyle w:val="VerbatimChar"/>
@@ -1377,8 +1863,8 @@
         </w:tc>
       </w:tr>
     </w:tbl>
-    <w:bookmarkEnd w:id="53"/>
-    <w:bookmarkStart w:id="55" w:name="what-each-tag-points-at"/>
+    <w:bookmarkEnd w:id="55"/>
+    <w:bookmarkStart w:id="60" w:name="what-each-tag-points-at"/>
     <w:p>
       <w:pPr>
         <w:pStyle w:val="Heading1"/>
@@ -1392,7 +1878,7 @@
         <w:pStyle w:val="FirstParagraph"/>
       </w:pPr>
       <w:r>
-        <w:t xml:space="preserve">Tags are annotated and each one marks the commit at which that milestone’s work</w:t>
+        <w:t xml:space="preserve">Tags are annotated and each one marks the commit at which that milestone's work</w:t>
       </w:r>
       <w:r>
         <w:t xml:space="preserve"> </w:t>
@@ -1403,32 +1889,39 @@
       <w:r>
         <w:t xml:space="preserve"> </w:t>
       </w:r>
-      <w:r>
-        <w:t xml:space="preserve">https://github.com/Samuelkaoma-eng/SKACE-TIME-DATA/tags</w:t>
-      </w:r>
+      <w:hyperlink r:id="rId56">
+        <w:r>
+          <w:rPr>
+            <w:rStyle w:val="Hyperlink"/>
+          </w:rPr>
+          <w:t xml:space="preserve">https://github.com/Samuelkaoma-eng/SKACE-TIME-DATA/tags</w:t>
+        </w:r>
+      </w:hyperlink>
     </w:p>
     <w:tbl>
       <w:tblPr>
         <w:tblStyle w:val="Table"/>
-        <w:tblW w:type="pct" w:w="5000"/>
-        <w:tblLayout w:type="fixed"/>
+        <w:tblW w:type="auto" w:w="0"/>
         <w:tblLook w:firstRow="1" w:lastRow="0" w:firstColumn="0" w:lastColumn="0" w:noHBand="0" w:noVBand="0" w:val="0020"/>
       </w:tblPr>
       <w:tblGrid>
-        <w:gridCol w:w="1980"/>
-        <w:gridCol w:w="1980"/>
-        <w:gridCol w:w="1980"/>
-        <w:gridCol w:w="1980"/>
+        <w:gridCol w:w="2080"/>
+        <w:gridCol w:w="1170"/>
+        <w:gridCol w:w="1560"/>
+        <w:gridCol w:w="4550"/>
       </w:tblGrid>
       <w:tr>
         <w:trPr>
           <w:tblHeader w:val="on"/>
         </w:trPr>
         <w:tc>
-          <w:tcPr/>
-          <w:p>
-            <w:pPr>
-              <w:pStyle w:val="Compact"/>
+          <w:tcPr>
+            <w:tcW w:type="dxa" w:w="2080"/>
+          </w:tcPr>
+          <w:p>
+            <w:pPr>
+              <w:pStyle w:val="Compact"/>
+              <w:jc w:val="left"/>
             </w:pPr>
             <w:r>
               <w:t xml:space="preserve">Tag</w:t>
@@ -1436,10 +1929,13 @@
           </w:p>
         </w:tc>
         <w:tc>
-          <w:tcPr/>
-          <w:p>
-            <w:pPr>
-              <w:pStyle w:val="Compact"/>
+          <w:tcPr>
+            <w:tcW w:type="dxa" w:w="1170"/>
+          </w:tcPr>
+          <w:p>
+            <w:pPr>
+              <w:pStyle w:val="Compact"/>
+              <w:jc w:val="left"/>
             </w:pPr>
             <w:r>
               <w:t xml:space="preserve">Commit</w:t>
@@ -1447,10 +1943,13 @@
           </w:p>
         </w:tc>
         <w:tc>
-          <w:tcPr/>
-          <w:p>
-            <w:pPr>
-              <w:pStyle w:val="Compact"/>
+          <w:tcPr>
+            <w:tcW w:type="dxa" w:w="1560"/>
+          </w:tcPr>
+          <w:p>
+            <w:pPr>
+              <w:pStyle w:val="Compact"/>
+              <w:jc w:val="left"/>
             </w:pPr>
             <w:r>
               <w:t xml:space="preserve">Date</w:t>
@@ -1458,10 +1957,13 @@
           </w:p>
         </w:tc>
         <w:tc>
-          <w:tcPr/>
-          <w:p>
-            <w:pPr>
-              <w:pStyle w:val="Compact"/>
+          <w:tcPr>
+            <w:tcW w:type="dxa" w:w="4550"/>
+          </w:tcPr>
+          <w:p>
+            <w:pPr>
+              <w:pStyle w:val="Compact"/>
+              <w:jc w:val="left"/>
             </w:pPr>
             <w:r>
               <w:t xml:space="preserve">What is verifiably present at that commit</w:t>
@@ -1471,12 +1973,15 @@
       </w:tr>
       <w:tr>
         <w:tc>
-          <w:tcPr/>
-          <w:p>
-            <w:pPr>
-              <w:pStyle w:val="Compact"/>
-            </w:pPr>
-            <w:hyperlink r:id="rId10">
+          <w:tcPr>
+            <w:tcW w:type="dxa" w:w="2080"/>
+          </w:tcPr>
+          <w:p>
+            <w:pPr>
+              <w:pStyle w:val="Compact"/>
+              <w:jc w:val="left"/>
+            </w:pPr>
+            <w:hyperlink r:id="rId16">
               <w:r>
                 <w:rPr>
                   <w:rStyle w:val="VerbatimChar"/>
@@ -1487,12 +1992,15 @@
           </w:p>
         </w:tc>
         <w:tc>
-          <w:tcPr/>
-          <w:p>
-            <w:pPr>
-              <w:pStyle w:val="Compact"/>
-            </w:pPr>
-            <w:hyperlink r:id="rId11">
+          <w:tcPr>
+            <w:tcW w:type="dxa" w:w="1170"/>
+          </w:tcPr>
+          <w:p>
+            <w:pPr>
+              <w:pStyle w:val="Compact"/>
+              <w:jc w:val="left"/>
+            </w:pPr>
+            <w:hyperlink r:id="rId17">
               <w:r>
                 <w:rPr>
                   <w:rStyle w:val="VerbatimChar"/>
@@ -1503,10 +2011,13 @@
           </w:p>
         </w:tc>
         <w:tc>
-          <w:tcPr/>
-          <w:p>
-            <w:pPr>
-              <w:pStyle w:val="Compact"/>
+          <w:tcPr>
+            <w:tcW w:type="dxa" w:w="1560"/>
+          </w:tcPr>
+          <w:p>
+            <w:pPr>
+              <w:pStyle w:val="Compact"/>
+              <w:jc w:val="left"/>
             </w:pPr>
             <w:r>
               <w:t xml:space="preserve">04/04/2026</w:t>
@@ -1514,10 +2025,13 @@
           </w:p>
         </w:tc>
         <w:tc>
-          <w:tcPr/>
-          <w:p>
-            <w:pPr>
-              <w:pStyle w:val="Compact"/>
+          <w:tcPr>
+            <w:tcW w:type="dxa" w:w="4550"/>
+          </w:tcPr>
+          <w:p>
+            <w:pPr>
+              <w:pStyle w:val="Compact"/>
+              <w:jc w:val="left"/>
             </w:pPr>
             <w:r>
               <w:t xml:space="preserve">Submitted proposal PDF, its Word source, the revised proposal text, and the 40-feature catalogue in</w:t>
@@ -1536,12 +2050,15 @@
       </w:tr>
       <w:tr>
         <w:tc>
-          <w:tcPr/>
-          <w:p>
-            <w:pPr>
-              <w:pStyle w:val="Compact"/>
-            </w:pPr>
-            <w:hyperlink r:id="rId13">
+          <w:tcPr>
+            <w:tcW w:type="dxa" w:w="2080"/>
+          </w:tcPr>
+          <w:p>
+            <w:pPr>
+              <w:pStyle w:val="Compact"/>
+              <w:jc w:val="left"/>
+            </w:pPr>
+            <w:hyperlink r:id="rId19">
               <w:r>
                 <w:rPr>
                   <w:rStyle w:val="VerbatimChar"/>
@@ -1552,12 +2069,15 @@
           </w:p>
         </w:tc>
         <w:tc>
-          <w:tcPr/>
-          <w:p>
-            <w:pPr>
-              <w:pStyle w:val="Compact"/>
-            </w:pPr>
-            <w:hyperlink r:id="rId16">
+          <w:tcPr>
+            <w:tcW w:type="dxa" w:w="1170"/>
+          </w:tcPr>
+          <w:p>
+            <w:pPr>
+              <w:pStyle w:val="Compact"/>
+              <w:jc w:val="left"/>
+            </w:pPr>
+            <w:hyperlink r:id="rId22">
               <w:r>
                 <w:rPr>
                   <w:rStyle w:val="VerbatimChar"/>
@@ -1568,10 +2088,13 @@
           </w:p>
         </w:tc>
         <w:tc>
-          <w:tcPr/>
-          <w:p>
-            <w:pPr>
-              <w:pStyle w:val="Compact"/>
+          <w:tcPr>
+            <w:tcW w:type="dxa" w:w="1560"/>
+          </w:tcPr>
+          <w:p>
+            <w:pPr>
+              <w:pStyle w:val="Compact"/>
+              <w:jc w:val="left"/>
             </w:pPr>
             <w:r>
               <w:t xml:space="preserve">11/04/2026</w:t>
@@ -1579,10 +2102,13 @@
           </w:p>
         </w:tc>
         <w:tc>
-          <w:tcPr/>
-          <w:p>
-            <w:pPr>
-              <w:pStyle w:val="Compact"/>
+          <w:tcPr>
+            <w:tcW w:type="dxa" w:w="4550"/>
+          </w:tcPr>
+          <w:p>
+            <w:pPr>
+              <w:pStyle w:val="Compact"/>
+              <w:jc w:val="left"/>
             </w:pPr>
             <w:r>
               <w:rPr>
@@ -1625,12 +2151,15 @@
       </w:tr>
       <w:tr>
         <w:tc>
-          <w:tcPr/>
-          <w:p>
-            <w:pPr>
-              <w:pStyle w:val="Compact"/>
-            </w:pPr>
-            <w:hyperlink r:id="rId28">
+          <w:tcPr>
+            <w:tcW w:type="dxa" w:w="2080"/>
+          </w:tcPr>
+          <w:p>
+            <w:pPr>
+              <w:pStyle w:val="Compact"/>
+              <w:jc w:val="left"/>
+            </w:pPr>
+            <w:hyperlink r:id="rId33">
               <w:r>
                 <w:rPr>
                   <w:rStyle w:val="VerbatimChar"/>
@@ -1641,12 +2170,15 @@
           </w:p>
         </w:tc>
         <w:tc>
-          <w:tcPr/>
-          <w:p>
-            <w:pPr>
-              <w:pStyle w:val="Compact"/>
-            </w:pPr>
-            <w:hyperlink r:id="rId31">
+          <w:tcPr>
+            <w:tcW w:type="dxa" w:w="1170"/>
+          </w:tcPr>
+          <w:p>
+            <w:pPr>
+              <w:pStyle w:val="Compact"/>
+              <w:jc w:val="left"/>
+            </w:pPr>
+            <w:hyperlink r:id="rId36">
               <w:r>
                 <w:rPr>
                   <w:rStyle w:val="VerbatimChar"/>
@@ -1657,10 +2189,13 @@
           </w:p>
         </w:tc>
         <w:tc>
-          <w:tcPr/>
-          <w:p>
-            <w:pPr>
-              <w:pStyle w:val="Compact"/>
+          <w:tcPr>
+            <w:tcW w:type="dxa" w:w="1560"/>
+          </w:tcPr>
+          <w:p>
+            <w:pPr>
+              <w:pStyle w:val="Compact"/>
+              <w:jc w:val="left"/>
             </w:pPr>
             <w:r>
               <w:t xml:space="preserve">06/07/2026</w:t>
@@ -1668,10 +2203,13 @@
           </w:p>
         </w:tc>
         <w:tc>
-          <w:tcPr/>
-          <w:p>
-            <w:pPr>
-              <w:pStyle w:val="Compact"/>
+          <w:tcPr>
+            <w:tcW w:type="dxa" w:w="4550"/>
+          </w:tcPr>
+          <w:p>
+            <w:pPr>
+              <w:pStyle w:val="Compact"/>
+              <w:jc w:val="left"/>
             </w:pPr>
             <w:r>
               <w:t xml:space="preserve">All four feature modules covering the 40 catalogued features, and the anomaly detector with generator-specific tuning removed</w:t>
@@ -1681,12 +2219,15 @@
       </w:tr>
       <w:tr>
         <w:tc>
-          <w:tcPr/>
-          <w:p>
-            <w:pPr>
-              <w:pStyle w:val="Compact"/>
-            </w:pPr>
-            <w:hyperlink r:id="rId34">
+          <w:tcPr>
+            <w:tcW w:type="dxa" w:w="2080"/>
+          </w:tcPr>
+          <w:p>
+            <w:pPr>
+              <w:pStyle w:val="Compact"/>
+              <w:jc w:val="left"/>
+            </w:pPr>
+            <w:hyperlink r:id="rId39">
               <w:r>
                 <w:rPr>
                   <w:rStyle w:val="VerbatimChar"/>
@@ -1697,12 +2238,15 @@
           </w:p>
         </w:tc>
         <w:tc>
-          <w:tcPr/>
-          <w:p>
-            <w:pPr>
-              <w:pStyle w:val="Compact"/>
-            </w:pPr>
-            <w:hyperlink r:id="rId54">
+          <w:tcPr>
+            <w:tcW w:type="dxa" w:w="1170"/>
+          </w:tcPr>
+          <w:p>
+            <w:pPr>
+              <w:pStyle w:val="Compact"/>
+              <w:jc w:val="left"/>
+            </w:pPr>
+            <w:hyperlink r:id="rId57">
               <w:r>
                 <w:rPr>
                   <w:rStyle w:val="VerbatimChar"/>
@@ -1713,10 +2257,13 @@
           </w:p>
         </w:tc>
         <w:tc>
-          <w:tcPr/>
-          <w:p>
-            <w:pPr>
-              <w:pStyle w:val="Compact"/>
+          <w:tcPr>
+            <w:tcW w:type="dxa" w:w="1560"/>
+          </w:tcPr>
+          <w:p>
+            <w:pPr>
+              <w:pStyle w:val="Compact"/>
+              <w:jc w:val="left"/>
             </w:pPr>
             <w:r>
               <w:t xml:space="preserve">25/08/2026</w:t>
@@ -1724,10 +2271,13 @@
           </w:p>
         </w:tc>
         <w:tc>
-          <w:tcPr/>
-          <w:p>
-            <w:pPr>
-              <w:pStyle w:val="Compact"/>
+          <w:tcPr>
+            <w:tcW w:type="dxa" w:w="4550"/>
+          </w:tcPr>
+          <w:p>
+            <w:pPr>
+              <w:pStyle w:val="Compact"/>
+              <w:jc w:val="left"/>
             </w:pPr>
             <w:r>
               <w:t xml:space="preserve">Validation report carrying the evidence set out for the 7 September milestone: validated tag, test command and output, feature coverage across all four families, metrics by anomaly type and by platform format with confusion counts, both baselines, effect sizes, and the class-imbalance check. Diagnostic on the fabricated false negatives in</w:t>
@@ -1746,12 +2296,15 @@
       </w:tr>
       <w:tr>
         <w:tc>
-          <w:tcPr/>
-          <w:p>
-            <w:pPr>
-              <w:pStyle w:val="Compact"/>
-            </w:pPr>
-            <w:hyperlink r:id="rId42">
+          <w:tcPr>
+            <w:tcW w:type="dxa" w:w="2080"/>
+          </w:tcPr>
+          <w:p>
+            <w:pPr>
+              <w:pStyle w:val="Compact"/>
+              <w:jc w:val="left"/>
+            </w:pPr>
+            <w:hyperlink r:id="rId46">
               <w:r>
                 <w:rPr>
                   <w:rStyle w:val="VerbatimChar"/>
@@ -1762,12 +2315,15 @@
           </w:p>
         </w:tc>
         <w:tc>
-          <w:tcPr/>
-          <w:p>
-            <w:pPr>
-              <w:pStyle w:val="Compact"/>
-            </w:pPr>
-            <w:hyperlink r:id="rId46">
+          <w:tcPr>
+            <w:tcW w:type="dxa" w:w="1170"/>
+          </w:tcPr>
+          <w:p>
+            <w:pPr>
+              <w:pStyle w:val="Compact"/>
+              <w:jc w:val="left"/>
+            </w:pPr>
+            <w:hyperlink r:id="rId50">
               <w:r>
                 <w:rPr>
                   <w:rStyle w:val="VerbatimChar"/>
@@ -1778,10 +2334,13 @@
           </w:p>
         </w:tc>
         <w:tc>
-          <w:tcPr/>
-          <w:p>
-            <w:pPr>
-              <w:pStyle w:val="Compact"/>
+          <w:tcPr>
+            <w:tcW w:type="dxa" w:w="1560"/>
+          </w:tcPr>
+          <w:p>
+            <w:pPr>
+              <w:pStyle w:val="Compact"/>
+              <w:jc w:val="left"/>
             </w:pPr>
             <w:r>
               <w:t xml:space="preserve">02/09/2026</w:t>
@@ -1789,13 +2348,84 @@
           </w:p>
         </w:tc>
         <w:tc>
-          <w:tcPr/>
-          <w:p>
-            <w:pPr>
-              <w:pStyle w:val="Compact"/>
+          <w:tcPr>
+            <w:tcW w:type="dxa" w:w="4550"/>
+          </w:tcPr>
+          <w:p>
+            <w:pPr>
+              <w:pStyle w:val="Compact"/>
+              <w:jc w:val="left"/>
             </w:pPr>
             <w:r>
               <w:t xml:space="preserve">Final report draft, all Word deliverables on a single document style with cover pages on the report, validation report and format guide, the presentation, the tracker, this index, the AI usage log, release metadata, and the completed validation report</w:t>
+            </w:r>
+          </w:p>
+        </w:tc>
+      </w:tr>
+      <w:tr>
+        <w:tc>
+          <w:tcPr>
+            <w:tcW w:type="dxa" w:w="2080"/>
+          </w:tcPr>
+          <w:p>
+            <w:pPr>
+              <w:pStyle w:val="Compact"/>
+              <w:jc w:val="left"/>
+            </w:pPr>
+            <w:hyperlink r:id="rId58">
+              <w:r>
+                <w:rPr>
+                  <w:rStyle w:val="VerbatimChar"/>
+                </w:rPr>
+                <w:t xml:space="preserve">v-resubmission</w:t>
+              </w:r>
+            </w:hyperlink>
+          </w:p>
+        </w:tc>
+        <w:tc>
+          <w:tcPr>
+            <w:tcW w:type="dxa" w:w="1170"/>
+          </w:tcPr>
+          <w:p>
+            <w:pPr>
+              <w:pStyle w:val="Compact"/>
+              <w:jc w:val="left"/>
+            </w:pPr>
+            <w:hyperlink r:id="rId59">
+              <w:r>
+                <w:rPr>
+                  <w:rStyle w:val="VerbatimChar"/>
+                </w:rPr>
+                <w:t xml:space="preserve">a432441</w:t>
+              </w:r>
+            </w:hyperlink>
+          </w:p>
+        </w:tc>
+        <w:tc>
+          <w:tcPr>
+            <w:tcW w:type="dxa" w:w="1560"/>
+          </w:tcPr>
+          <w:p>
+            <w:pPr>
+              <w:pStyle w:val="Compact"/>
+              <w:jc w:val="left"/>
+            </w:pPr>
+            <w:r>
+              <w:t xml:space="preserve">16/09/2026</w:t>
+            </w:r>
+          </w:p>
+        </w:tc>
+        <w:tc>
+          <w:tcPr>
+            <w:tcW w:type="dxa" w:w="4550"/>
+          </w:tcPr>
+          <w:p>
+            <w:pPr>
+              <w:pStyle w:val="Compact"/>
+              <w:jc w:val="left"/>
+            </w:pPr>
+            <w:r>
+              <w:t xml:space="preserve">Report revised against the supervisor review: literature review rebuilt from verified sources, reference verification record (Appendix E), feature-to-source map (Appendix F), baselines under stress, platform parity on matched histories, measured memory, native ODK audit log support, and every script Appendix D names. 43 tests passing.</w:t>
             </w:r>
           </w:p>
         </w:tc>
@@ -1841,38 +2471,17 @@
         <w:pStyle w:val="BodyText"/>
       </w:pPr>
       <w:r>
-        <w:t xml:space="preserve">Two entries in the system,</w:t>
+        <w:t xml:space="preserve">Two entries in the system, "Final report and submission" and "Final Submission", share the</w:t>
       </w:r>
       <w:r>
         <w:t xml:space="preserve"> </w:t>
       </w:r>
       <w:r>
-        <w:t xml:space="preserve">“Final report and submission”</w:t>
-      </w:r>
-      <w:r>
-        <w:t xml:space="preserve"> </w:t>
-      </w:r>
-      <w:r>
-        <w:t xml:space="preserve">and</w:t>
-      </w:r>
-      <w:r>
-        <w:t xml:space="preserve"> </w:t>
-      </w:r>
-      <w:r>
-        <w:t xml:space="preserve">“Final Submission”</w:t>
-      </w:r>
-      <w:r>
-        <w:t xml:space="preserve">, share the</w:t>
-      </w:r>
-      <w:r>
-        <w:t xml:space="preserve"> </w:t>
-      </w:r>
-      <w:r>
         <w:t xml:space="preserve">29/09/2026 date and appear to be duplicates; this is queried with the supervisor.</w:t>
       </w:r>
     </w:p>
-    <w:bookmarkEnd w:id="55"/>
-    <w:bookmarkStart w:id="68" w:name="X343555567a2f7f017c0602652a29739aa6e8b64"/>
+    <w:bookmarkEnd w:id="60"/>
+    <w:bookmarkStart w:id="74" w:name="X343555567a2f7f017c0602652a29739aa6e8b64"/>
     <w:p>
       <w:pPr>
         <w:pStyle w:val="Heading1"/>
@@ -1884,23 +2493,25 @@
     <w:tbl>
       <w:tblPr>
         <w:tblStyle w:val="Table"/>
-        <w:tblW w:type="pct" w:w="5000"/>
-        <w:tblLayout w:type="fixed"/>
+        <w:tblW w:type="auto" w:w="0"/>
         <w:tblLook w:firstRow="1" w:lastRow="0" w:firstColumn="0" w:lastColumn="0" w:noHBand="0" w:noVBand="0" w:val="0020"/>
       </w:tblPr>
       <w:tblGrid>
-        <w:gridCol w:w="3960"/>
-        <w:gridCol w:w="3960"/>
+        <w:gridCol w:w="2080"/>
+        <w:gridCol w:w="7280"/>
       </w:tblGrid>
       <w:tr>
         <w:trPr>
           <w:tblHeader w:val="on"/>
         </w:trPr>
         <w:tc>
-          <w:tcPr/>
-          <w:p>
-            <w:pPr>
-              <w:pStyle w:val="Compact"/>
+          <w:tcPr>
+            <w:tcW w:type="dxa" w:w="2080"/>
+          </w:tcPr>
+          <w:p>
+            <w:pPr>
+              <w:pStyle w:val="Compact"/>
+              <w:jc w:val="left"/>
             </w:pPr>
             <w:r>
               <w:t xml:space="preserve">Deliverable</w:t>
@@ -1908,10 +2519,13 @@
           </w:p>
         </w:tc>
         <w:tc>
-          <w:tcPr/>
-          <w:p>
-            <w:pPr>
-              <w:pStyle w:val="Compact"/>
+          <w:tcPr>
+            <w:tcW w:type="dxa" w:w="7280"/>
+          </w:tcPr>
+          <w:p>
+            <w:pPr>
+              <w:pStyle w:val="Compact"/>
+              <w:jc w:val="left"/>
             </w:pPr>
             <w:r>
               <w:t xml:space="preserve">Location</w:t>
@@ -1921,10 +2535,13 @@
       </w:tr>
       <w:tr>
         <w:tc>
-          <w:tcPr/>
-          <w:p>
-            <w:pPr>
-              <w:pStyle w:val="Compact"/>
+          <w:tcPr>
+            <w:tcW w:type="dxa" w:w="2080"/>
+          </w:tcPr>
+          <w:p>
+            <w:pPr>
+              <w:pStyle w:val="Compact"/>
+              <w:jc w:val="left"/>
             </w:pPr>
             <w:r>
               <w:t xml:space="preserve">Python feature library (40 features)</w:t>
@@ -1932,12 +2549,15 @@
           </w:p>
         </w:tc>
         <w:tc>
-          <w:tcPr/>
-          <w:p>
-            <w:pPr>
-              <w:pStyle w:val="Compact"/>
-            </w:pPr>
-            <w:hyperlink r:id="rId32">
+          <w:tcPr>
+            <w:tcW w:type="dxa" w:w="7280"/>
+          </w:tcPr>
+          <w:p>
+            <w:pPr>
+              <w:pStyle w:val="Compact"/>
+              <w:jc w:val="left"/>
+            </w:pPr>
+            <w:hyperlink r:id="rId37">
               <w:r>
                 <w:rPr>
                   <w:rStyle w:val="VerbatimChar"/>
@@ -1951,7 +2571,7 @@
             <w:r>
               <w:t xml:space="preserve"> </w:t>
             </w:r>
-            <w:hyperlink r:id="rId22">
+            <w:hyperlink r:id="rId27">
               <w:r>
                 <w:rPr>
                   <w:rStyle w:val="VerbatimChar"/>
@@ -1965,7 +2585,7 @@
             <w:r>
               <w:t xml:space="preserve"> </w:t>
             </w:r>
-            <w:hyperlink r:id="rId56">
+            <w:hyperlink r:id="rId61">
               <w:r>
                 <w:rPr>
                   <w:rStyle w:val="VerbatimChar"/>
@@ -1978,10 +2598,13 @@
       </w:tr>
       <w:tr>
         <w:tc>
-          <w:tcPr/>
-          <w:p>
-            <w:pPr>
-              <w:pStyle w:val="Compact"/>
+          <w:tcPr>
+            <w:tcW w:type="dxa" w:w="2080"/>
+          </w:tcPr>
+          <w:p>
+            <w:pPr>
+              <w:pStyle w:val="Compact"/>
+              <w:jc w:val="left"/>
             </w:pPr>
             <w:r>
               <w:t xml:space="preserve">Paradata format guide</w:t>
@@ -1989,12 +2612,15 @@
           </w:p>
         </w:tc>
         <w:tc>
-          <w:tcPr/>
-          <w:p>
-            <w:pPr>
-              <w:pStyle w:val="Compact"/>
-            </w:pPr>
-            <w:hyperlink r:id="rId57">
+          <w:tcPr>
+            <w:tcW w:type="dxa" w:w="7280"/>
+          </w:tcPr>
+          <w:p>
+            <w:pPr>
+              <w:pStyle w:val="Compact"/>
+              <w:jc w:val="left"/>
+            </w:pPr>
+            <w:hyperlink r:id="rId62">
               <w:r>
                 <w:rPr>
                   <w:rStyle w:val="VerbatimChar"/>
@@ -2008,7 +2634,7 @@
             <w:r>
               <w:t xml:space="preserve"> </w:t>
             </w:r>
-            <w:hyperlink r:id="rId58">
+            <w:hyperlink r:id="rId63">
               <w:r>
                 <w:rPr>
                   <w:rStyle w:val="Hyperlink"/>
@@ -2021,10 +2647,13 @@
       </w:tr>
       <w:tr>
         <w:tc>
-          <w:tcPr/>
-          <w:p>
-            <w:pPr>
-              <w:pStyle w:val="Compact"/>
+          <w:tcPr>
+            <w:tcW w:type="dxa" w:w="2080"/>
+          </w:tcPr>
+          <w:p>
+            <w:pPr>
+              <w:pStyle w:val="Compact"/>
+              <w:jc w:val="left"/>
             </w:pPr>
             <w:r>
               <w:t xml:space="preserve">Synthetic validation datasets</w:t>
@@ -2032,12 +2661,15 @@
           </w:p>
         </w:tc>
         <w:tc>
-          <w:tcPr/>
-          <w:p>
-            <w:pPr>
-              <w:pStyle w:val="Compact"/>
-            </w:pPr>
-            <w:hyperlink r:id="rId59">
+          <w:tcPr>
+            <w:tcW w:type="dxa" w:w="7280"/>
+          </w:tcPr>
+          <w:p>
+            <w:pPr>
+              <w:pStyle w:val="Compact"/>
+              <w:jc w:val="left"/>
+            </w:pPr>
+            <w:hyperlink r:id="rId64">
               <w:r>
                 <w:rPr>
                   <w:rStyle w:val="VerbatimChar"/>
@@ -2096,7 +2728,7 @@
             <w:r>
               <w:t xml:space="preserve"> </w:t>
             </w:r>
-            <w:hyperlink r:id="rId60">
+            <w:hyperlink r:id="rId65">
               <w:r>
                 <w:rPr>
                   <w:rStyle w:val="VerbatimChar"/>
@@ -2109,10 +2741,13 @@
       </w:tr>
       <w:tr>
         <w:tc>
-          <w:tcPr/>
-          <w:p>
-            <w:pPr>
-              <w:pStyle w:val="Compact"/>
+          <w:tcPr>
+            <w:tcW w:type="dxa" w:w="2080"/>
+          </w:tcPr>
+          <w:p>
+            <w:pPr>
+              <w:pStyle w:val="Compact"/>
+              <w:jc w:val="left"/>
             </w:pPr>
             <w:r>
               <w:t xml:space="preserve">Validation report</w:t>
@@ -2120,12 +2755,15 @@
           </w:p>
         </w:tc>
         <w:tc>
-          <w:tcPr/>
-          <w:p>
-            <w:pPr>
-              <w:pStyle w:val="Compact"/>
-            </w:pPr>
-            <w:hyperlink r:id="rId40">
+          <w:tcPr>
+            <w:tcW w:type="dxa" w:w="7280"/>
+          </w:tcPr>
+          <w:p>
+            <w:pPr>
+              <w:pStyle w:val="Compact"/>
+              <w:jc w:val="left"/>
+            </w:pPr>
+            <w:hyperlink r:id="rId45">
               <w:r>
                 <w:rPr>
                   <w:rStyle w:val="VerbatimChar"/>
@@ -2139,7 +2777,7 @@
             <w:r>
               <w:t xml:space="preserve"> </w:t>
             </w:r>
-            <w:hyperlink r:id="rId61">
+            <w:hyperlink r:id="rId66">
               <w:r>
                 <w:rPr>
                   <w:rStyle w:val="Hyperlink"/>
@@ -2152,10 +2790,13 @@
       </w:tr>
       <w:tr>
         <w:tc>
-          <w:tcPr/>
-          <w:p>
-            <w:pPr>
-              <w:pStyle w:val="Compact"/>
+          <w:tcPr>
+            <w:tcW w:type="dxa" w:w="2080"/>
+          </w:tcPr>
+          <w:p>
+            <w:pPr>
+              <w:pStyle w:val="Compact"/>
+              <w:jc w:val="left"/>
             </w:pPr>
             <w:r>
               <w:t xml:space="preserve">Final paper</w:t>
@@ -2163,12 +2804,15 @@
           </w:p>
         </w:tc>
         <w:tc>
-          <w:tcPr/>
-          <w:p>
-            <w:pPr>
-              <w:pStyle w:val="Compact"/>
-            </w:pPr>
-            <w:hyperlink r:id="rId21">
+          <w:tcPr>
+            <w:tcW w:type="dxa" w:w="7280"/>
+          </w:tcPr>
+          <w:p>
+            <w:pPr>
+              <w:pStyle w:val="Compact"/>
+              <w:jc w:val="left"/>
+            </w:pPr>
+            <w:hyperlink r:id="rId26">
               <w:r>
                 <w:rPr>
                   <w:rStyle w:val="VerbatimChar"/>
@@ -2182,7 +2826,7 @@
             <w:r>
               <w:t xml:space="preserve"> </w:t>
             </w:r>
-            <w:hyperlink r:id="rId47">
+            <w:hyperlink r:id="rId51">
               <w:r>
                 <w:rPr>
                   <w:rStyle w:val="Hyperlink"/>
@@ -2190,15 +2834,21 @@
                 <w:t xml:space="preserve">SAMUEL KAOMA 2022016530 Final Report.docx</w:t>
               </w:r>
             </w:hyperlink>
+            <w:r>
+              <w:t xml:space="preserve">. Carries front matter, three figures and Appendices A to D: AI usage disclosure, per-run confusion counts, full feature validity results and reproduction commands</w:t>
+            </w:r>
           </w:p>
         </w:tc>
       </w:tr>
       <w:tr>
         <w:tc>
-          <w:tcPr/>
-          <w:p>
-            <w:pPr>
-              <w:pStyle w:val="Compact"/>
+          <w:tcPr>
+            <w:tcW w:type="dxa" w:w="2080"/>
+          </w:tcPr>
+          <w:p>
+            <w:pPr>
+              <w:pStyle w:val="Compact"/>
+              <w:jc w:val="left"/>
             </w:pPr>
             <w:r>
               <w:t xml:space="preserve">Structured output dataset and visualisations</w:t>
@@ -2206,17 +2856,34 @@
           </w:p>
         </w:tc>
         <w:tc>
-          <w:tcPr/>
-          <w:p>
-            <w:pPr>
-              <w:pStyle w:val="Compact"/>
-            </w:pPr>
-            <w:hyperlink r:id="rId62">
+          <w:tcPr>
+            <w:tcW w:type="dxa" w:w="7280"/>
+          </w:tcPr>
+          <w:p>
+            <w:pPr>
+              <w:pStyle w:val="Compact"/>
+              <w:jc w:val="left"/>
+            </w:pPr>
+            <w:hyperlink r:id="rId67">
               <w:r>
                 <w:rPr>
                   <w:rStyle w:val="VerbatimChar"/>
                 </w:rPr>
                 <w:t xml:space="preserve">output/</w:t>
+              </w:r>
+            </w:hyperlink>
+            <w:r>
+              <w:t xml:space="preserve">, report figures in</w:t>
+            </w:r>
+            <w:r>
+              <w:t xml:space="preserve"> </w:t>
+            </w:r>
+            <w:hyperlink r:id="rId68">
+              <w:r>
+                <w:rPr>
+                  <w:rStyle w:val="VerbatimChar"/>
+                </w:rPr>
+                <w:t xml:space="preserve">report/figures/</w:t>
               </w:r>
             </w:hyperlink>
           </w:p>
@@ -2224,10 +2891,13 @@
       </w:tr>
       <w:tr>
         <w:tc>
-          <w:tcPr/>
-          <w:p>
-            <w:pPr>
-              <w:pStyle w:val="Compact"/>
+          <w:tcPr>
+            <w:tcW w:type="dxa" w:w="2080"/>
+          </w:tcPr>
+          <w:p>
+            <w:pPr>
+              <w:pStyle w:val="Compact"/>
+              <w:jc w:val="left"/>
             </w:pPr>
             <w:r>
               <w:t xml:space="preserve">AI Usage Log (section 9.4)</w:t>
@@ -2235,12 +2905,45 @@
           </w:p>
         </w:tc>
         <w:tc>
-          <w:tcPr/>
-          <w:p>
-            <w:pPr>
-              <w:pStyle w:val="Compact"/>
-            </w:pPr>
-            <w:hyperlink r:id="rId63">
+          <w:tcPr>
+            <w:tcW w:type="dxa" w:w="7280"/>
+          </w:tcPr>
+          <w:p>
+            <w:pPr>
+              <w:pStyle w:val="Compact"/>
+              <w:jc w:val="left"/>
+            </w:pPr>
+            <w:r>
+              <w:rPr>
+                <w:b/>
+                <w:bCs/>
+              </w:rPr>
+              <w:t xml:space="preserve">Appendix A</w:t>
+            </w:r>
+            <w:r>
+              <w:t xml:space="preserve"> </w:t>
+            </w:r>
+            <w:r>
+              <w:t xml:space="preserve">of</w:t>
+            </w:r>
+            <w:r>
+              <w:t xml:space="preserve"> </w:t>
+            </w:r>
+            <w:hyperlink r:id="rId26">
+              <w:r>
+                <w:rPr>
+                  <w:rStyle w:val="VerbatimChar"/>
+                </w:rPr>
+                <w:t xml:space="preserve">report/final_academic_report.md</w:t>
+              </w:r>
+            </w:hyperlink>
+            <w:r>
+              <w:t xml:space="preserve">; repository copy</w:t>
+            </w:r>
+            <w:r>
+              <w:t xml:space="preserve"> </w:t>
+            </w:r>
+            <w:hyperlink r:id="rId69">
               <w:r>
                 <w:rPr>
                   <w:rStyle w:val="VerbatimChar"/>
@@ -2249,12 +2952,12 @@
               </w:r>
             </w:hyperlink>
             <w:r>
-              <w:t xml:space="preserve">,</w:t>
-            </w:r>
-            <w:r>
-              <w:t xml:space="preserve"> </w:t>
-            </w:r>
-            <w:hyperlink r:id="rId64">
+              <w:t xml:space="preserve">, standalone</w:t>
+            </w:r>
+            <w:r>
+              <w:t xml:space="preserve"> </w:t>
+            </w:r>
+            <w:hyperlink r:id="rId70">
               <w:r>
                 <w:rPr>
                   <w:rStyle w:val="Hyperlink"/>
@@ -2267,10 +2970,13 @@
       </w:tr>
       <w:tr>
         <w:tc>
-          <w:tcPr/>
-          <w:p>
-            <w:pPr>
-              <w:pStyle w:val="Compact"/>
+          <w:tcPr>
+            <w:tcW w:type="dxa" w:w="2080"/>
+          </w:tcPr>
+          <w:p>
+            <w:pPr>
+              <w:pStyle w:val="Compact"/>
+              <w:jc w:val="left"/>
             </w:pPr>
             <w:r>
               <w:t xml:space="preserve">Release metadata</w:t>
@@ -2278,12 +2984,15 @@
           </w:p>
         </w:tc>
         <w:tc>
-          <w:tcPr/>
-          <w:p>
-            <w:pPr>
-              <w:pStyle w:val="Compact"/>
-            </w:pPr>
-            <w:hyperlink r:id="rId65">
+          <w:tcPr>
+            <w:tcW w:type="dxa" w:w="7280"/>
+          </w:tcPr>
+          <w:p>
+            <w:pPr>
+              <w:pStyle w:val="Compact"/>
+              <w:jc w:val="left"/>
+            </w:pPr>
+            <w:hyperlink r:id="rId71">
               <w:r>
                 <w:rPr>
                   <w:rStyle w:val="VerbatimChar"/>
@@ -2297,7 +3006,7 @@
             <w:r>
               <w:t xml:space="preserve"> </w:t>
             </w:r>
-            <w:hyperlink r:id="rId66">
+            <w:hyperlink r:id="rId72">
               <w:r>
                 <w:rPr>
                   <w:rStyle w:val="VerbatimChar"/>
@@ -2311,7 +3020,7 @@
             <w:r>
               <w:t xml:space="preserve"> </w:t>
             </w:r>
-            <w:hyperlink r:id="rId67">
+            <w:hyperlink r:id="rId73">
               <w:r>
                 <w:rPr>
                   <w:rStyle w:val="VerbatimChar"/>
@@ -2323,8 +3032,8 @@
         </w:tc>
       </w:tr>
     </w:tbl>
-    <w:bookmarkEnd w:id="68"/>
-    <w:bookmarkStart w:id="69" w:name="key-commits-what-each-one-proves"/>
+    <w:bookmarkEnd w:id="74"/>
+    <w:bookmarkStart w:id="75" w:name="key-commits-what-each-one-proves"/>
     <w:p>
       <w:pPr>
         <w:pStyle w:val="Heading1"/>
@@ -2336,23 +3045,25 @@
     <w:tbl>
       <w:tblPr>
         <w:tblStyle w:val="Table"/>
-        <w:tblW w:type="pct" w:w="5000"/>
-        <w:tblLayout w:type="fixed"/>
+        <w:tblW w:type="auto" w:w="0"/>
         <w:tblLook w:firstRow="1" w:lastRow="0" w:firstColumn="0" w:lastColumn="0" w:noHBand="0" w:noVBand="0" w:val="0020"/>
       </w:tblPr>
       <w:tblGrid>
-        <w:gridCol w:w="3960"/>
-        <w:gridCol w:w="3960"/>
+        <w:gridCol w:w="1170"/>
+        <w:gridCol w:w="8190"/>
       </w:tblGrid>
       <w:tr>
         <w:trPr>
           <w:tblHeader w:val="on"/>
         </w:trPr>
         <w:tc>
-          <w:tcPr/>
-          <w:p>
-            <w:pPr>
-              <w:pStyle w:val="Compact"/>
+          <w:tcPr>
+            <w:tcW w:type="dxa" w:w="1170"/>
+          </w:tcPr>
+          <w:p>
+            <w:pPr>
+              <w:pStyle w:val="Compact"/>
+              <w:jc w:val="left"/>
             </w:pPr>
             <w:r>
               <w:t xml:space="preserve">Commit</w:t>
@@ -2360,10 +3071,13 @@
           </w:p>
         </w:tc>
         <w:tc>
-          <w:tcPr/>
-          <w:p>
-            <w:pPr>
-              <w:pStyle w:val="Compact"/>
+          <w:tcPr>
+            <w:tcW w:type="dxa" w:w="8190"/>
+          </w:tcPr>
+          <w:p>
+            <w:pPr>
+              <w:pStyle w:val="Compact"/>
+              <w:jc w:val="left"/>
             </w:pPr>
             <w:r>
               <w:t xml:space="preserve">Proves</w:t>
@@ -2373,12 +3087,15 @@
       </w:tr>
       <w:tr>
         <w:tc>
-          <w:tcPr/>
-          <w:p>
-            <w:pPr>
-              <w:pStyle w:val="Compact"/>
-            </w:pPr>
-            <w:hyperlink r:id="rId14">
+          <w:tcPr>
+            <w:tcW w:type="dxa" w:w="1170"/>
+          </w:tcPr>
+          <w:p>
+            <w:pPr>
+              <w:pStyle w:val="Compact"/>
+              <w:jc w:val="left"/>
+            </w:pPr>
+            <w:hyperlink r:id="rId20">
               <w:r>
                 <w:rPr>
                   <w:rStyle w:val="VerbatimChar"/>
@@ -2389,10 +3106,13 @@
           </w:p>
         </w:tc>
         <w:tc>
-          <w:tcPr/>
-          <w:p>
-            <w:pPr>
-              <w:pStyle w:val="Compact"/>
+          <w:tcPr>
+            <w:tcW w:type="dxa" w:w="8190"/>
+          </w:tcPr>
+          <w:p>
+            <w:pPr>
+              <w:pStyle w:val="Compact"/>
+              <w:jc w:val="left"/>
             </w:pPr>
             <w:r>
               <w:t xml:space="preserve">Modular parsers and pipeline controller built</w:t>
@@ -2402,12 +3122,15 @@
       </w:tr>
       <w:tr>
         <w:tc>
-          <w:tcPr/>
-          <w:p>
-            <w:pPr>
-              <w:pStyle w:val="Compact"/>
-            </w:pPr>
-            <w:hyperlink r:id="rId23">
+          <w:tcPr>
+            <w:tcW w:type="dxa" w:w="1170"/>
+          </w:tcPr>
+          <w:p>
+            <w:pPr>
+              <w:pStyle w:val="Compact"/>
+              <w:jc w:val="left"/>
+            </w:pPr>
+            <w:hyperlink r:id="rId28">
               <w:r>
                 <w:rPr>
                   <w:rStyle w:val="VerbatimChar"/>
@@ -2418,10 +3141,13 @@
           </w:p>
         </w:tc>
         <w:tc>
-          <w:tcPr/>
-          <w:p>
-            <w:pPr>
-              <w:pStyle w:val="Compact"/>
+          <w:tcPr>
+            <w:tcW w:type="dxa" w:w="8190"/>
+          </w:tcPr>
+          <w:p>
+            <w:pPr>
+              <w:pStyle w:val="Compact"/>
+              <w:jc w:val="left"/>
             </w:pPr>
             <w:r>
               <w:t xml:space="preserve">Hybrid file handling: both platforms in one export</w:t>
@@ -2431,12 +3157,15 @@
       </w:tr>
       <w:tr>
         <w:tc>
-          <w:tcPr/>
-          <w:p>
-            <w:pPr>
-              <w:pStyle w:val="Compact"/>
-            </w:pPr>
-            <w:hyperlink r:id="rId15">
+          <w:tcPr>
+            <w:tcW w:type="dxa" w:w="1170"/>
+          </w:tcPr>
+          <w:p>
+            <w:pPr>
+              <w:pStyle w:val="Compact"/>
+              <w:jc w:val="left"/>
+            </w:pPr>
+            <w:hyperlink r:id="rId21">
               <w:r>
                 <w:rPr>
                   <w:rStyle w:val="VerbatimChar"/>
@@ -2447,10 +3176,13 @@
           </w:p>
         </w:tc>
         <w:tc>
-          <w:tcPr/>
-          <w:p>
-            <w:pPr>
-              <w:pStyle w:val="Compact"/>
+          <w:tcPr>
+            <w:tcW w:type="dxa" w:w="8190"/>
+          </w:tcPr>
+          <w:p>
+            <w:pPr>
+              <w:pStyle w:val="Compact"/>
+              <w:jc w:val="left"/>
             </w:pPr>
             <w:r>
               <w:t xml:space="preserve">Full 40-feature extraction with taxonomy alignment</w:t>
@@ -2460,12 +3192,15 @@
       </w:tr>
       <w:tr>
         <w:tc>
-          <w:tcPr/>
-          <w:p>
-            <w:pPr>
-              <w:pStyle w:val="Compact"/>
-            </w:pPr>
-            <w:hyperlink r:id="rId29">
+          <w:tcPr>
+            <w:tcW w:type="dxa" w:w="1170"/>
+          </w:tcPr>
+          <w:p>
+            <w:pPr>
+              <w:pStyle w:val="Compact"/>
+              <w:jc w:val="left"/>
+            </w:pPr>
+            <w:hyperlink r:id="rId34">
               <w:r>
                 <w:rPr>
                   <w:rStyle w:val="VerbatimChar"/>
@@ -2476,10 +3211,13 @@
           </w:p>
         </w:tc>
         <w:tc>
-          <w:tcPr/>
-          <w:p>
-            <w:pPr>
-              <w:pStyle w:val="Compact"/>
+          <w:tcPr>
+            <w:tcW w:type="dxa" w:w="8190"/>
+          </w:tcPr>
+          <w:p>
+            <w:pPr>
+              <w:pStyle w:val="Compact"/>
+              <w:jc w:val="left"/>
             </w:pPr>
             <w:r>
               <w:t xml:space="preserve">Granular question-level and section-level exports</w:t>
@@ -2489,12 +3227,15 @@
       </w:tr>
       <w:tr>
         <w:tc>
-          <w:tcPr/>
-          <w:p>
-            <w:pPr>
-              <w:pStyle w:val="Compact"/>
-            </w:pPr>
-            <w:hyperlink r:id="rId31">
+          <w:tcPr>
+            <w:tcW w:type="dxa" w:w="1170"/>
+          </w:tcPr>
+          <w:p>
+            <w:pPr>
+              <w:pStyle w:val="Compact"/>
+              <w:jc w:val="left"/>
+            </w:pPr>
+            <w:hyperlink r:id="rId36">
               <w:r>
                 <w:rPr>
                   <w:rStyle w:val="VerbatimChar"/>
@@ -2505,10 +3246,13 @@
           </w:p>
         </w:tc>
         <w:tc>
-          <w:tcPr/>
-          <w:p>
-            <w:pPr>
-              <w:pStyle w:val="Compact"/>
+          <w:tcPr>
+            <w:tcW w:type="dxa" w:w="8190"/>
+          </w:tcPr>
+          <w:p>
+            <w:pPr>
+              <w:pStyle w:val="Compact"/>
+              <w:jc w:val="left"/>
             </w:pPr>
             <w:r>
               <w:t xml:space="preserve">Generator realism upgrade, detector de-tuning, held-out robustness round</w:t>
@@ -2518,12 +3262,15 @@
       </w:tr>
       <w:tr>
         <w:tc>
-          <w:tcPr/>
-          <w:p>
-            <w:pPr>
-              <w:pStyle w:val="Compact"/>
-            </w:pPr>
-            <w:hyperlink r:id="rId43">
+          <w:tcPr>
+            <w:tcW w:type="dxa" w:w="1170"/>
+          </w:tcPr>
+          <w:p>
+            <w:pPr>
+              <w:pStyle w:val="Compact"/>
+              <w:jc w:val="left"/>
+            </w:pPr>
+            <w:hyperlink r:id="rId47">
               <w:r>
                 <w:rPr>
                   <w:rStyle w:val="VerbatimChar"/>
@@ -2534,10 +3281,13 @@
           </w:p>
         </w:tc>
         <w:tc>
-          <w:tcPr/>
-          <w:p>
-            <w:pPr>
-              <w:pStyle w:val="Compact"/>
+          <w:tcPr>
+            <w:tcW w:type="dxa" w:w="8190"/>
+          </w:tcPr>
+          <w:p>
+            <w:pPr>
+              <w:pStyle w:val="Compact"/>
+              <w:jc w:val="left"/>
             </w:pPr>
             <w:r>
               <w:t xml:space="preserve">Final report with Harvard referencing and validation results</w:t>
@@ -2547,12 +3297,15 @@
       </w:tr>
       <w:tr>
         <w:tc>
-          <w:tcPr/>
-          <w:p>
-            <w:pPr>
-              <w:pStyle w:val="Compact"/>
-            </w:pPr>
-            <w:hyperlink r:id="rId24">
+          <w:tcPr>
+            <w:tcW w:type="dxa" w:w="1170"/>
+          </w:tcPr>
+          <w:p>
+            <w:pPr>
+              <w:pStyle w:val="Compact"/>
+              <w:jc w:val="left"/>
+            </w:pPr>
+            <w:hyperlink r:id="rId29">
               <w:r>
                 <w:rPr>
                   <w:rStyle w:val="VerbatimChar"/>
@@ -2563,10 +3316,13 @@
           </w:p>
         </w:tc>
         <w:tc>
-          <w:tcPr/>
-          <w:p>
-            <w:pPr>
-              <w:pStyle w:val="Compact"/>
+          <w:tcPr>
+            <w:tcW w:type="dxa" w:w="8190"/>
+          </w:tcPr>
+          <w:p>
+            <w:pPr>
+              <w:pStyle w:val="Compact"/>
+              <w:jc w:val="left"/>
             </w:pPr>
             <w:r>
               <w:t xml:space="preserve">Clean-environment fixes: pandas 3 timestamps and the Q-01 feature</w:t>
@@ -2576,12 +3332,15 @@
       </w:tr>
       <w:tr>
         <w:tc>
-          <w:tcPr/>
-          <w:p>
-            <w:pPr>
-              <w:pStyle w:val="Compact"/>
-            </w:pPr>
-            <w:hyperlink r:id="rId38">
+          <w:tcPr>
+            <w:tcW w:type="dxa" w:w="1170"/>
+          </w:tcPr>
+          <w:p>
+            <w:pPr>
+              <w:pStyle w:val="Compact"/>
+              <w:jc w:val="left"/>
+            </w:pPr>
+            <w:hyperlink r:id="rId43">
               <w:r>
                 <w:rPr>
                   <w:rStyle w:val="VerbatimChar"/>
@@ -2592,10 +3351,13 @@
           </w:p>
         </w:tc>
         <w:tc>
-          <w:tcPr/>
-          <w:p>
-            <w:pPr>
-              <w:pStyle w:val="Compact"/>
+          <w:tcPr>
+            <w:tcW w:type="dxa" w:w="8190"/>
+          </w:tcPr>
+          <w:p>
+            <w:pPr>
+              <w:pStyle w:val="Compact"/>
+              <w:jc w:val="left"/>
             </w:pPr>
             <w:r>
               <w:t xml:space="preserve">Outputs and notebook regenerated from the clean run</w:t>
@@ -2605,12 +3367,15 @@
       </w:tr>
       <w:tr>
         <w:tc>
-          <w:tcPr/>
-          <w:p>
-            <w:pPr>
-              <w:pStyle w:val="Compact"/>
-            </w:pPr>
-            <w:hyperlink r:id="rId44">
+          <w:tcPr>
+            <w:tcW w:type="dxa" w:w="1170"/>
+          </w:tcPr>
+          <w:p>
+            <w:pPr>
+              <w:pStyle w:val="Compact"/>
+              <w:jc w:val="left"/>
+            </w:pPr>
+            <w:hyperlink r:id="rId48">
               <w:r>
                 <w:rPr>
                   <w:rStyle w:val="VerbatimChar"/>
@@ -2621,10 +3386,13 @@
           </w:p>
         </w:tc>
         <w:tc>
-          <w:tcPr/>
-          <w:p>
-            <w:pPr>
-              <w:pStyle w:val="Compact"/>
+          <w:tcPr>
+            <w:tcW w:type="dxa" w:w="8190"/>
+          </w:tcPr>
+          <w:p>
+            <w:pPr>
+              <w:pStyle w:val="Compact"/>
+              <w:jc w:val="left"/>
             </w:pPr>
             <w:r>
               <w:t xml:space="preserve">Word deliverables and presentation rebuilt from the reconciled sources</w:t>
@@ -2634,12 +3402,15 @@
       </w:tr>
       <w:tr>
         <w:tc>
-          <w:tcPr/>
-          <w:p>
-            <w:pPr>
-              <w:pStyle w:val="Compact"/>
-            </w:pPr>
-            <w:hyperlink r:id="rId49">
+          <w:tcPr>
+            <w:tcW w:type="dxa" w:w="1170"/>
+          </w:tcPr>
+          <w:p>
+            <w:pPr>
+              <w:pStyle w:val="Compact"/>
+              <w:jc w:val="left"/>
+            </w:pPr>
+            <w:hyperlink r:id="rId53">
               <w:r>
                 <w:rPr>
                   <w:rStyle w:val="VerbatimChar"/>
@@ -2650,10 +3421,13 @@
           </w:p>
         </w:tc>
         <w:tc>
-          <w:tcPr/>
-          <w:p>
-            <w:pPr>
-              <w:pStyle w:val="Compact"/>
+          <w:tcPr>
+            <w:tcW w:type="dxa" w:w="8190"/>
+          </w:tcPr>
+          <w:p>
+            <w:pPr>
+              <w:pStyle w:val="Compact"/>
+              <w:jc w:val="left"/>
             </w:pPr>
             <w:r>
               <w:t xml:space="preserve">Presentation architecture diagram (latest state)</w:t>
@@ -2663,12 +3437,15 @@
       </w:tr>
       <w:tr>
         <w:tc>
-          <w:tcPr/>
-          <w:p>
-            <w:pPr>
-              <w:pStyle w:val="Compact"/>
-            </w:pPr>
-            <w:hyperlink r:id="rId45">
+          <w:tcPr>
+            <w:tcW w:type="dxa" w:w="1170"/>
+          </w:tcPr>
+          <w:p>
+            <w:pPr>
+              <w:pStyle w:val="Compact"/>
+              <w:jc w:val="left"/>
+            </w:pPr>
+            <w:hyperlink r:id="rId49">
               <w:r>
                 <w:rPr>
                   <w:rStyle w:val="VerbatimChar"/>
@@ -2679,10 +3456,13 @@
           </w:p>
         </w:tc>
         <w:tc>
-          <w:tcPr/>
-          <w:p>
-            <w:pPr>
-              <w:pStyle w:val="Compact"/>
+          <w:tcPr>
+            <w:tcW w:type="dxa" w:w="8190"/>
+          </w:tcPr>
+          <w:p>
+            <w:pPr>
+              <w:pStyle w:val="Compact"/>
+              <w:jc w:val="left"/>
             </w:pPr>
             <w:r>
               <w:t xml:space="preserve">Milestone tags retargeted to</w:t>
@@ -2711,7 +3491,7 @@
         <w:t xml:space="preserve">Links resolve for anyone with access to the repository. To confirm a single point live, open the commits page and read the message and changed files for the hash named above.</w:t>
       </w:r>
     </w:p>
-    <w:bookmarkEnd w:id="69"/>
+    <w:bookmarkEnd w:id="75"/>
     <w:sectPr>
       <w:footnotePr>
         <w:numRestart w:val="eachSect"/>
@@ -3497,6 +4277,11 @@
     <w:qFormat/>
     <w:tblPr>
       <w:tblInd w:type="dxa" w:w="0"/>
+      <w:tblBorders>
+        <w:top w:val="single" w:sz="8" w:space="0" w:color="auto"/>
+        <w:bottom w:val="single" w:sz="8" w:space="0" w:color="auto"/>
+        <w:insideH w:val="single" w:sz="2" w:space="0" w:color="BFBFBF"/>
+      </w:tblBorders>
       <w:tblCellMar>
         <w:top w:type="dxa" w:w="0"/>
         <w:left w:type="dxa" w:w="108"/>
@@ -3507,7 +4292,7 @@
     <w:tblStylePr w:type="firstRow">
       <w:tcPr>
         <w:tcBorders>
-          <w:bottom w:val="single"/>
+          <w:bottom w:val="single" w:sz="8" w:space="0" w:color="auto"/>
         </w:tcBorders>
         <w:vAlign w:val="bottom"/>
       </w:tcPr>
@@ -3612,7 +4397,7 @@
       <w:color w:themeColor="accent1" w:themeShade="BF" w:val="365F91"/>
     </w:rPr>
   </w:style>
-  <w:style w:type="paragraph" w:customStyle="1" w:styleId="SourceCode">
+  <w:style w:customStyle="1" w:styleId="SourceCode" w:type="paragraph">
     <w:name w:val="Source Code"/>
     <w:basedOn w:val="Normal"/>
     <w:link w:val="VerbatimChar"/>
@@ -3620,7 +4405,7 @@
       <w:wordWrap w:val="off"/>
     </w:pPr>
   </w:style>
-  <w:style w:type="character" w:customStyle="1" w:styleId="KeywordTok">
+  <w:style w:customStyle="1" w:styleId="KeywordTok" w:type="character">
     <w:name w:val="KeywordTok"/>
     <w:basedOn w:val="VerbatimChar"/>
     <w:rPr>
@@ -3628,77 +4413,77 @@
       <w:color w:val="007020"/>
     </w:rPr>
   </w:style>
-  <w:style w:type="character" w:customStyle="1" w:styleId="DataTypeTok">
+  <w:style w:customStyle="1" w:styleId="DataTypeTok" w:type="character">
     <w:name w:val="DataTypeTok"/>
     <w:basedOn w:val="VerbatimChar"/>
     <w:rPr>
       <w:color w:val="902000"/>
     </w:rPr>
   </w:style>
-  <w:style w:type="character" w:customStyle="1" w:styleId="DecValTok">
+  <w:style w:customStyle="1" w:styleId="DecValTok" w:type="character">
     <w:name w:val="DecValTok"/>
     <w:basedOn w:val="VerbatimChar"/>
     <w:rPr>
       <w:color w:val="40a070"/>
     </w:rPr>
   </w:style>
-  <w:style w:type="character" w:customStyle="1" w:styleId="BaseNTok">
+  <w:style w:customStyle="1" w:styleId="BaseNTok" w:type="character">
     <w:name w:val="BaseNTok"/>
     <w:basedOn w:val="VerbatimChar"/>
     <w:rPr>
       <w:color w:val="40a070"/>
     </w:rPr>
   </w:style>
-  <w:style w:type="character" w:customStyle="1" w:styleId="FloatTok">
+  <w:style w:customStyle="1" w:styleId="FloatTok" w:type="character">
     <w:name w:val="FloatTok"/>
     <w:basedOn w:val="VerbatimChar"/>
     <w:rPr>
       <w:color w:val="40a070"/>
     </w:rPr>
   </w:style>
-  <w:style w:type="character" w:customStyle="1" w:styleId="ConstantTok">
+  <w:style w:customStyle="1" w:styleId="ConstantTok" w:type="character">
     <w:name w:val="ConstantTok"/>
     <w:basedOn w:val="VerbatimChar"/>
     <w:rPr>
       <w:color w:val="880000"/>
     </w:rPr>
   </w:style>
-  <w:style w:type="character" w:customStyle="1" w:styleId="CharTok">
+  <w:style w:customStyle="1" w:styleId="CharTok" w:type="character">
     <w:name w:val="CharTok"/>
     <w:basedOn w:val="VerbatimChar"/>
     <w:rPr>
       <w:color w:val="4070a0"/>
     </w:rPr>
   </w:style>
-  <w:style w:type="character" w:customStyle="1" w:styleId="SpecialCharTok">
+  <w:style w:customStyle="1" w:styleId="SpecialCharTok" w:type="character">
     <w:name w:val="SpecialCharTok"/>
     <w:basedOn w:val="VerbatimChar"/>
     <w:rPr>
       <w:color w:val="4070a0"/>
     </w:rPr>
   </w:style>
-  <w:style w:type="character" w:customStyle="1" w:styleId="StringTok">
+  <w:style w:customStyle="1" w:styleId="StringTok" w:type="character">
     <w:name w:val="StringTok"/>
     <w:basedOn w:val="VerbatimChar"/>
     <w:rPr>
       <w:color w:val="4070a0"/>
     </w:rPr>
   </w:style>
-  <w:style w:type="character" w:customStyle="1" w:styleId="VerbatimStringTok">
+  <w:style w:customStyle="1" w:styleId="VerbatimStringTok" w:type="character">
     <w:name w:val="VerbatimStringTok"/>
     <w:basedOn w:val="VerbatimChar"/>
     <w:rPr>
       <w:color w:val="4070a0"/>
     </w:rPr>
   </w:style>
-  <w:style w:type="character" w:customStyle="1" w:styleId="SpecialStringTok">
+  <w:style w:customStyle="1" w:styleId="SpecialStringTok" w:type="character">
     <w:name w:val="SpecialStringTok"/>
     <w:basedOn w:val="VerbatimChar"/>
     <w:rPr>
       <w:color w:val="bb6688"/>
     </w:rPr>
   </w:style>
-  <w:style w:type="character" w:customStyle="1" w:styleId="ImportTok">
+  <w:style w:customStyle="1" w:styleId="ImportTok" w:type="character">
     <w:name w:val="ImportTok"/>
     <w:basedOn w:val="VerbatimChar"/>
     <w:rPr>
@@ -3706,7 +4491,7 @@
       <w:color w:val="008000"/>
     </w:rPr>
   </w:style>
-  <w:style w:type="character" w:customStyle="1" w:styleId="CommentTok">
+  <w:style w:customStyle="1" w:styleId="CommentTok" w:type="character">
     <w:name w:val="CommentTok"/>
     <w:basedOn w:val="VerbatimChar"/>
     <w:rPr>
@@ -3714,7 +4499,7 @@
       <w:color w:val="60a0b0"/>
     </w:rPr>
   </w:style>
-  <w:style w:type="character" w:customStyle="1" w:styleId="DocumentationTok">
+  <w:style w:customStyle="1" w:styleId="DocumentationTok" w:type="character">
     <w:name w:val="DocumentationTok"/>
     <w:basedOn w:val="VerbatimChar"/>
     <w:rPr>
@@ -3722,7 +4507,7 @@
       <w:color w:val="ba2121"/>
     </w:rPr>
   </w:style>
-  <w:style w:type="character" w:customStyle="1" w:styleId="AnnotationTok">
+  <w:style w:customStyle="1" w:styleId="AnnotationTok" w:type="character">
     <w:name w:val="AnnotationTok"/>
     <w:basedOn w:val="VerbatimChar"/>
     <w:rPr>
@@ -3731,7 +4516,7 @@
       <w:color w:val="60a0b0"/>
     </w:rPr>
   </w:style>
-  <w:style w:type="character" w:customStyle="1" w:styleId="CommentVarTok">
+  <w:style w:customStyle="1" w:styleId="CommentVarTok" w:type="character">
     <w:name w:val="CommentVarTok"/>
     <w:basedOn w:val="VerbatimChar"/>
     <w:rPr>
@@ -3740,28 +4525,28 @@
       <w:color w:val="60a0b0"/>
     </w:rPr>
   </w:style>
-  <w:style w:type="character" w:customStyle="1" w:styleId="OtherTok">
+  <w:style w:customStyle="1" w:styleId="OtherTok" w:type="character">
     <w:name w:val="OtherTok"/>
     <w:basedOn w:val="VerbatimChar"/>
     <w:rPr>
       <w:color w:val="007020"/>
     </w:rPr>
   </w:style>
-  <w:style w:type="character" w:customStyle="1" w:styleId="FunctionTok">
+  <w:style w:customStyle="1" w:styleId="FunctionTok" w:type="character">
     <w:name w:val="FunctionTok"/>
     <w:basedOn w:val="VerbatimChar"/>
     <w:rPr>
       <w:color w:val="06287e"/>
     </w:rPr>
   </w:style>
-  <w:style w:type="character" w:customStyle="1" w:styleId="VariableTok">
+  <w:style w:customStyle="1" w:styleId="VariableTok" w:type="character">
     <w:name w:val="VariableTok"/>
     <w:basedOn w:val="VerbatimChar"/>
     <w:rPr>
       <w:color w:val="19177c"/>
     </w:rPr>
   </w:style>
-  <w:style w:type="character" w:customStyle="1" w:styleId="ControlFlowTok">
+  <w:style w:customStyle="1" w:styleId="ControlFlowTok" w:type="character">
     <w:name w:val="ControlFlowTok"/>
     <w:basedOn w:val="VerbatimChar"/>
     <w:rPr>
@@ -3769,45 +4554,45 @@
       <w:color w:val="007020"/>
     </w:rPr>
   </w:style>
-  <w:style w:type="character" w:customStyle="1" w:styleId="OperatorTok">
+  <w:style w:customStyle="1" w:styleId="OperatorTok" w:type="character">
     <w:name w:val="OperatorTok"/>
     <w:basedOn w:val="VerbatimChar"/>
     <w:rPr>
       <w:color w:val="666666"/>
     </w:rPr>
   </w:style>
-  <w:style w:type="character" w:customStyle="1" w:styleId="BuiltInTok">
+  <w:style w:customStyle="1" w:styleId="BuiltInTok" w:type="character">
     <w:name w:val="BuiltInTok"/>
     <w:basedOn w:val="VerbatimChar"/>
     <w:rPr>
       <w:color w:val="008000"/>
     </w:rPr>
   </w:style>
-  <w:style w:type="character" w:customStyle="1" w:styleId="ExtensionTok">
+  <w:style w:customStyle="1" w:styleId="ExtensionTok" w:type="character">
     <w:name w:val="ExtensionTok"/>
     <w:basedOn w:val="VerbatimChar"/>
     <w:rPr/>
   </w:style>
-  <w:style w:type="character" w:customStyle="1" w:styleId="PreprocessorTok">
+  <w:style w:customStyle="1" w:styleId="PreprocessorTok" w:type="character">
     <w:name w:val="PreprocessorTok"/>
     <w:basedOn w:val="VerbatimChar"/>
     <w:rPr>
       <w:color w:val="bc7a00"/>
     </w:rPr>
   </w:style>
-  <w:style w:type="character" w:customStyle="1" w:styleId="AttributeTok">
+  <w:style w:customStyle="1" w:styleId="AttributeTok" w:type="character">
     <w:name w:val="AttributeTok"/>
     <w:basedOn w:val="VerbatimChar"/>
     <w:rPr>
       <w:color w:val="7d9029"/>
     </w:rPr>
   </w:style>
-  <w:style w:type="character" w:customStyle="1" w:styleId="RegionMarkerTok">
+  <w:style w:customStyle="1" w:styleId="RegionMarkerTok" w:type="character">
     <w:name w:val="RegionMarkerTok"/>
     <w:basedOn w:val="VerbatimChar"/>
     <w:rPr/>
   </w:style>
-  <w:style w:type="character" w:customStyle="1" w:styleId="InformationTok">
+  <w:style w:customStyle="1" w:styleId="InformationTok" w:type="character">
     <w:name w:val="InformationTok"/>
     <w:basedOn w:val="VerbatimChar"/>
     <w:rPr>
@@ -3816,7 +4601,7 @@
       <w:color w:val="60a0b0"/>
     </w:rPr>
   </w:style>
-  <w:style w:type="character" w:customStyle="1" w:styleId="WarningTok">
+  <w:style w:customStyle="1" w:styleId="WarningTok" w:type="character">
     <w:name w:val="WarningTok"/>
     <w:basedOn w:val="VerbatimChar"/>
     <w:rPr>
@@ -3825,7 +4610,7 @@
       <w:color w:val="60a0b0"/>
     </w:rPr>
   </w:style>
-  <w:style w:type="character" w:customStyle="1" w:styleId="AlertTok">
+  <w:style w:customStyle="1" w:styleId="AlertTok" w:type="character">
     <w:name w:val="AlertTok"/>
     <w:basedOn w:val="VerbatimChar"/>
     <w:rPr>
@@ -3833,7 +4618,7 @@
       <w:color w:val="ff0000"/>
     </w:rPr>
   </w:style>
-  <w:style w:type="character" w:customStyle="1" w:styleId="ErrorTok">
+  <w:style w:customStyle="1" w:styleId="ErrorTok" w:type="character">
     <w:name w:val="ErrorTok"/>
     <w:basedOn w:val="VerbatimChar"/>
     <w:rPr>
@@ -3841,7 +4626,7 @@
       <w:color w:val="ff0000"/>
     </w:rPr>
   </w:style>
-  <w:style w:type="character" w:customStyle="1" w:styleId="NormalTok">
+  <w:style w:customStyle="1" w:styleId="NormalTok" w:type="character">
     <w:name w:val="NormalTok"/>
     <w:basedOn w:val="VerbatimChar"/>
     <w:rPr/>

</xml_diff>

<commit_message>
Point the evidence index at the resubmission tag rather than a fixed hash
The tag was moved as late corrections landed, so a hard-coded commit hash in the
evidence index went stale after each one. The row now names the tag and the
command that resolves it, which stays correct wherever the tag points.
</commit_message>
<xml_diff>
--- a/docs/deliverables/Evidence_Index.docx
+++ b/docs/deliverables/Evidence_Index.docx
@@ -1864,7 +1864,7 @@
       </w:tr>
     </w:tbl>
     <w:bookmarkEnd w:id="55"/>
-    <w:bookmarkStart w:id="60" w:name="what-each-tag-points-at"/>
+    <w:bookmarkStart w:id="59" w:name="what-each-tag-points-at"/>
     <w:p>
       <w:pPr>
         <w:pStyle w:val="Heading1"/>
@@ -1906,9 +1906,9 @@
       </w:tblPr>
       <w:tblGrid>
         <w:gridCol w:w="2080"/>
-        <w:gridCol w:w="1170"/>
+        <w:gridCol w:w="2080"/>
         <w:gridCol w:w="1560"/>
-        <w:gridCol w:w="4550"/>
+        <w:gridCol w:w="3640"/>
       </w:tblGrid>
       <w:tr>
         <w:trPr>
@@ -1930,7 +1930,7 @@
         </w:tc>
         <w:tc>
           <w:tcPr>
-            <w:tcW w:type="dxa" w:w="1170"/>
+            <w:tcW w:type="dxa" w:w="2080"/>
           </w:tcPr>
           <w:p>
             <w:pPr>
@@ -1958,7 +1958,7 @@
         </w:tc>
         <w:tc>
           <w:tcPr>
-            <w:tcW w:type="dxa" w:w="4550"/>
+            <w:tcW w:type="dxa" w:w="3640"/>
           </w:tcPr>
           <w:p>
             <w:pPr>
@@ -1993,7 +1993,7 @@
         </w:tc>
         <w:tc>
           <w:tcPr>
-            <w:tcW w:type="dxa" w:w="1170"/>
+            <w:tcW w:type="dxa" w:w="2080"/>
           </w:tcPr>
           <w:p>
             <w:pPr>
@@ -2026,7 +2026,7 @@
         </w:tc>
         <w:tc>
           <w:tcPr>
-            <w:tcW w:type="dxa" w:w="4550"/>
+            <w:tcW w:type="dxa" w:w="3640"/>
           </w:tcPr>
           <w:p>
             <w:pPr>
@@ -2070,7 +2070,7 @@
         </w:tc>
         <w:tc>
           <w:tcPr>
-            <w:tcW w:type="dxa" w:w="1170"/>
+            <w:tcW w:type="dxa" w:w="2080"/>
           </w:tcPr>
           <w:p>
             <w:pPr>
@@ -2103,7 +2103,7 @@
         </w:tc>
         <w:tc>
           <w:tcPr>
-            <w:tcW w:type="dxa" w:w="4550"/>
+            <w:tcW w:type="dxa" w:w="3640"/>
           </w:tcPr>
           <w:p>
             <w:pPr>
@@ -2171,7 +2171,7 @@
         </w:tc>
         <w:tc>
           <w:tcPr>
-            <w:tcW w:type="dxa" w:w="1170"/>
+            <w:tcW w:type="dxa" w:w="2080"/>
           </w:tcPr>
           <w:p>
             <w:pPr>
@@ -2204,7 +2204,7 @@
         </w:tc>
         <w:tc>
           <w:tcPr>
-            <w:tcW w:type="dxa" w:w="4550"/>
+            <w:tcW w:type="dxa" w:w="3640"/>
           </w:tcPr>
           <w:p>
             <w:pPr>
@@ -2239,7 +2239,7 @@
         </w:tc>
         <w:tc>
           <w:tcPr>
-            <w:tcW w:type="dxa" w:w="1170"/>
+            <w:tcW w:type="dxa" w:w="2080"/>
           </w:tcPr>
           <w:p>
             <w:pPr>
@@ -2272,7 +2272,7 @@
         </w:tc>
         <w:tc>
           <w:tcPr>
-            <w:tcW w:type="dxa" w:w="4550"/>
+            <w:tcW w:type="dxa" w:w="3640"/>
           </w:tcPr>
           <w:p>
             <w:pPr>
@@ -2316,7 +2316,7 @@
         </w:tc>
         <w:tc>
           <w:tcPr>
-            <w:tcW w:type="dxa" w:w="1170"/>
+            <w:tcW w:type="dxa" w:w="2080"/>
           </w:tcPr>
           <w:p>
             <w:pPr>
@@ -2349,7 +2349,7 @@
         </w:tc>
         <w:tc>
           <w:tcPr>
-            <w:tcW w:type="dxa" w:w="4550"/>
+            <w:tcW w:type="dxa" w:w="3640"/>
           </w:tcPr>
           <w:p>
             <w:pPr>
@@ -2384,21 +2384,25 @@
         </w:tc>
         <w:tc>
           <w:tcPr>
-            <w:tcW w:type="dxa" w:w="1170"/>
-          </w:tcPr>
-          <w:p>
-            <w:pPr>
-              <w:pStyle w:val="Compact"/>
-              <w:jc w:val="left"/>
-            </w:pPr>
-            <w:hyperlink r:id="rId59">
-              <w:r>
-                <w:rPr>
-                  <w:rStyle w:val="VerbatimChar"/>
-                </w:rPr>
-                <w:t xml:space="preserve">4f62574</w:t>
-              </w:r>
-            </w:hyperlink>
+            <w:tcW w:type="dxa" w:w="2080"/>
+          </w:tcPr>
+          <w:p>
+            <w:pPr>
+              <w:pStyle w:val="Compact"/>
+              <w:jc w:val="left"/>
+            </w:pPr>
+            <w:r>
+              <w:t xml:space="preserve">the tagged commit, resolved by</w:t>
+            </w:r>
+            <w:r>
+              <w:t xml:space="preserve"> </w:t>
+            </w:r>
+            <w:r>
+              <w:rPr>
+                <w:rStyle w:val="VerbatimChar"/>
+              </w:rPr>
+              <w:t xml:space="preserve">git rev-parse v-resubmission</w:t>
+            </w:r>
           </w:p>
         </w:tc>
         <w:tc>
@@ -2417,7 +2421,7 @@
         </w:tc>
         <w:tc>
           <w:tcPr>
-            <w:tcW w:type="dxa" w:w="4550"/>
+            <w:tcW w:type="dxa" w:w="3640"/>
           </w:tcPr>
           <w:p>
             <w:pPr>
@@ -2480,8 +2484,8 @@
         <w:t xml:space="preserve">29/09/2026 date and appear to be duplicates; this is queried with the supervisor.</w:t>
       </w:r>
     </w:p>
-    <w:bookmarkEnd w:id="60"/>
-    <w:bookmarkStart w:id="74" w:name="X343555567a2f7f017c0602652a29739aa6e8b64"/>
+    <w:bookmarkEnd w:id="59"/>
+    <w:bookmarkStart w:id="73" w:name="X343555567a2f7f017c0602652a29739aa6e8b64"/>
     <w:p>
       <w:pPr>
         <w:pStyle w:val="Heading1"/>
@@ -2585,7 +2589,7 @@
             <w:r>
               <w:t xml:space="preserve"> </w:t>
             </w:r>
-            <w:hyperlink r:id="rId61">
+            <w:hyperlink r:id="rId60">
               <w:r>
                 <w:rPr>
                   <w:rStyle w:val="VerbatimChar"/>
@@ -2620,21 +2624,21 @@
               <w:pStyle w:val="Compact"/>
               <w:jc w:val="left"/>
             </w:pPr>
+            <w:hyperlink r:id="rId61">
+              <w:r>
+                <w:rPr>
+                  <w:rStyle w:val="VerbatimChar"/>
+                </w:rPr>
+                <w:t xml:space="preserve">docs/paradata_format_guide.md</w:t>
+              </w:r>
+            </w:hyperlink>
+            <w:r>
+              <w:t xml:space="preserve">,</w:t>
+            </w:r>
+            <w:r>
+              <w:t xml:space="preserve"> </w:t>
+            </w:r>
             <w:hyperlink r:id="rId62">
-              <w:r>
-                <w:rPr>
-                  <w:rStyle w:val="VerbatimChar"/>
-                </w:rPr>
-                <w:t xml:space="preserve">docs/paradata_format_guide.md</w:t>
-              </w:r>
-            </w:hyperlink>
-            <w:r>
-              <w:t xml:space="preserve">,</w:t>
-            </w:r>
-            <w:r>
-              <w:t xml:space="preserve"> </w:t>
-            </w:r>
-            <w:hyperlink r:id="rId63">
               <w:r>
                 <w:rPr>
                   <w:rStyle w:val="Hyperlink"/>
@@ -2669,66 +2673,66 @@
               <w:pStyle w:val="Compact"/>
               <w:jc w:val="left"/>
             </w:pPr>
+            <w:hyperlink r:id="rId63">
+              <w:r>
+                <w:rPr>
+                  <w:rStyle w:val="VerbatimChar"/>
+                </w:rPr>
+                <w:t xml:space="preserve">data/synthetic_datasets/</w:t>
+              </w:r>
+            </w:hyperlink>
+            <w:r>
+              <w:t xml:space="preserve"> </w:t>
+            </w:r>
+            <w:r>
+              <w:t xml:space="preserve">(</w:t>
+            </w:r>
+            <w:r>
+              <w:rPr>
+                <w:rStyle w:val="VerbatimChar"/>
+              </w:rPr>
+              <w:t xml:space="preserve">n500</w:t>
+            </w:r>
+            <w:r>
+              <w:t xml:space="preserve"> </w:t>
+            </w:r>
+            <w:r>
+              <w:t xml:space="preserve">and</w:t>
+            </w:r>
+            <w:r>
+              <w:t xml:space="preserve"> </w:t>
+            </w:r>
+            <w:r>
+              <w:rPr>
+                <w:rStyle w:val="VerbatimChar"/>
+              </w:rPr>
+              <w:t xml:space="preserve">n2000</w:t>
+            </w:r>
+            <w:r>
+              <w:t xml:space="preserve"> </w:t>
+            </w:r>
+            <w:r>
+              <w:t xml:space="preserve">tracked;</w:t>
+            </w:r>
+            <w:r>
+              <w:t xml:space="preserve"> </w:t>
+            </w:r>
+            <w:r>
+              <w:rPr>
+                <w:rStyle w:val="VerbatimChar"/>
+              </w:rPr>
+              <w:t xml:space="preserve">n10000</w:t>
+            </w:r>
+            <w:r>
+              <w:t xml:space="preserve"> </w:t>
+            </w:r>
+            <w:r>
+              <w:t xml:space="preserve">regenerated from the README command),</w:t>
+            </w:r>
+            <w:r>
+              <w:t xml:space="preserve"> </w:t>
+            </w:r>
             <w:hyperlink r:id="rId64">
-              <w:r>
-                <w:rPr>
-                  <w:rStyle w:val="VerbatimChar"/>
-                </w:rPr>
-                <w:t xml:space="preserve">data/synthetic_datasets/</w:t>
-              </w:r>
-            </w:hyperlink>
-            <w:r>
-              <w:t xml:space="preserve"> </w:t>
-            </w:r>
-            <w:r>
-              <w:t xml:space="preserve">(</w:t>
-            </w:r>
-            <w:r>
-              <w:rPr>
-                <w:rStyle w:val="VerbatimChar"/>
-              </w:rPr>
-              <w:t xml:space="preserve">n500</w:t>
-            </w:r>
-            <w:r>
-              <w:t xml:space="preserve"> </w:t>
-            </w:r>
-            <w:r>
-              <w:t xml:space="preserve">and</w:t>
-            </w:r>
-            <w:r>
-              <w:t xml:space="preserve"> </w:t>
-            </w:r>
-            <w:r>
-              <w:rPr>
-                <w:rStyle w:val="VerbatimChar"/>
-              </w:rPr>
-              <w:t xml:space="preserve">n2000</w:t>
-            </w:r>
-            <w:r>
-              <w:t xml:space="preserve"> </w:t>
-            </w:r>
-            <w:r>
-              <w:t xml:space="preserve">tracked;</w:t>
-            </w:r>
-            <w:r>
-              <w:t xml:space="preserve"> </w:t>
-            </w:r>
-            <w:r>
-              <w:rPr>
-                <w:rStyle w:val="VerbatimChar"/>
-              </w:rPr>
-              <w:t xml:space="preserve">n10000</w:t>
-            </w:r>
-            <w:r>
-              <w:t xml:space="preserve"> </w:t>
-            </w:r>
-            <w:r>
-              <w:t xml:space="preserve">regenerated from the README command),</w:t>
-            </w:r>
-            <w:r>
-              <w:t xml:space="preserve"> </w:t>
-            </w:r>
-            <w:hyperlink r:id="rId65">
               <w:r>
                 <w:rPr>
                   <w:rStyle w:val="VerbatimChar"/>
@@ -2777,7 +2781,7 @@
             <w:r>
               <w:t xml:space="preserve"> </w:t>
             </w:r>
-            <w:hyperlink r:id="rId66">
+            <w:hyperlink r:id="rId65">
               <w:r>
                 <w:rPr>
                   <w:rStyle w:val="Hyperlink"/>
@@ -2864,21 +2868,21 @@
               <w:pStyle w:val="Compact"/>
               <w:jc w:val="left"/>
             </w:pPr>
+            <w:hyperlink r:id="rId66">
+              <w:r>
+                <w:rPr>
+                  <w:rStyle w:val="VerbatimChar"/>
+                </w:rPr>
+                <w:t xml:space="preserve">output/</w:t>
+              </w:r>
+            </w:hyperlink>
+            <w:r>
+              <w:t xml:space="preserve">, report figures in</w:t>
+            </w:r>
+            <w:r>
+              <w:t xml:space="preserve"> </w:t>
+            </w:r>
             <w:hyperlink r:id="rId67">
-              <w:r>
-                <w:rPr>
-                  <w:rStyle w:val="VerbatimChar"/>
-                </w:rPr>
-                <w:t xml:space="preserve">output/</w:t>
-              </w:r>
-            </w:hyperlink>
-            <w:r>
-              <w:t xml:space="preserve">, report figures in</w:t>
-            </w:r>
-            <w:r>
-              <w:t xml:space="preserve"> </w:t>
-            </w:r>
-            <w:hyperlink r:id="rId68">
               <w:r>
                 <w:rPr>
                   <w:rStyle w:val="VerbatimChar"/>
@@ -2943,21 +2947,21 @@
             <w:r>
               <w:t xml:space="preserve"> </w:t>
             </w:r>
+            <w:hyperlink r:id="rId68">
+              <w:r>
+                <w:rPr>
+                  <w:rStyle w:val="VerbatimChar"/>
+                </w:rPr>
+                <w:t xml:space="preserve">docs/ai_usage_log.md</w:t>
+              </w:r>
+            </w:hyperlink>
+            <w:r>
+              <w:t xml:space="preserve">, standalone</w:t>
+            </w:r>
+            <w:r>
+              <w:t xml:space="preserve"> </w:t>
+            </w:r>
             <w:hyperlink r:id="rId69">
-              <w:r>
-                <w:rPr>
-                  <w:rStyle w:val="VerbatimChar"/>
-                </w:rPr>
-                <w:t xml:space="preserve">docs/ai_usage_log.md</w:t>
-              </w:r>
-            </w:hyperlink>
-            <w:r>
-              <w:t xml:space="preserve">, standalone</w:t>
-            </w:r>
-            <w:r>
-              <w:t xml:space="preserve"> </w:t>
-            </w:r>
-            <w:hyperlink r:id="rId70">
               <w:r>
                 <w:rPr>
                   <w:rStyle w:val="Hyperlink"/>
@@ -2992,12 +2996,26 @@
               <w:pStyle w:val="Compact"/>
               <w:jc w:val="left"/>
             </w:pPr>
+            <w:hyperlink r:id="rId70">
+              <w:r>
+                <w:rPr>
+                  <w:rStyle w:val="VerbatimChar"/>
+                </w:rPr>
+                <w:t xml:space="preserve">LICENSE</w:t>
+              </w:r>
+            </w:hyperlink>
+            <w:r>
+              <w:t xml:space="preserve">,</w:t>
+            </w:r>
+            <w:r>
+              <w:t xml:space="preserve"> </w:t>
+            </w:r>
             <w:hyperlink r:id="rId71">
               <w:r>
                 <w:rPr>
                   <w:rStyle w:val="VerbatimChar"/>
                 </w:rPr>
-                <w:t xml:space="preserve">LICENSE</w:t>
+                <w:t xml:space="preserve">CITATION.cff</w:t>
               </w:r>
             </w:hyperlink>
             <w:r>
@@ -3007,20 +3025,6 @@
               <w:t xml:space="preserve"> </w:t>
             </w:r>
             <w:hyperlink r:id="rId72">
-              <w:r>
-                <w:rPr>
-                  <w:rStyle w:val="VerbatimChar"/>
-                </w:rPr>
-                <w:t xml:space="preserve">CITATION.cff</w:t>
-              </w:r>
-            </w:hyperlink>
-            <w:r>
-              <w:t xml:space="preserve">,</w:t>
-            </w:r>
-            <w:r>
-              <w:t xml:space="preserve"> </w:t>
-            </w:r>
-            <w:hyperlink r:id="rId73">
               <w:r>
                 <w:rPr>
                   <w:rStyle w:val="VerbatimChar"/>
@@ -3032,8 +3036,8 @@
         </w:tc>
       </w:tr>
     </w:tbl>
-    <w:bookmarkEnd w:id="74"/>
-    <w:bookmarkStart w:id="75" w:name="key-commits-what-each-one-proves"/>
+    <w:bookmarkEnd w:id="73"/>
+    <w:bookmarkStart w:id="74" w:name="key-commits-what-each-one-proves"/>
     <w:p>
       <w:pPr>
         <w:pStyle w:val="Heading1"/>
@@ -3491,7 +3495,7 @@
         <w:t xml:space="preserve">Links resolve for anyone with access to the repository. To confirm a single point live, open the commits page and read the message and changed files for the hash named above.</w:t>
       </w:r>
     </w:p>
-    <w:bookmarkEnd w:id="75"/>
+    <w:bookmarkEnd w:id="74"/>
     <w:sectPr>
       <w:footnotePr>
         <w:numRestart w:val="eachSect"/>

</xml_diff>